<commit_message>
Updates to the PTCP workflow with latest template changes
</commit_message>
<xml_diff>
--- a/PacBio_PureTarget_Report/PacBioPureTarget.docx
+++ b/PacBio_PureTarget_Report/PacBioPureTarget.docx
@@ -22,8 +22,17 @@
           <w:sz w:val="32"/>
           <w:szCs w:val="32"/>
         </w:rPr>
-        <w:t>acBio PureTarget</w:t>
-      </w:r>
+        <w:t xml:space="preserve">acBio </w:t>
+      </w:r>
+      <w:proofErr w:type="spellStart"/>
+      <w:r>
+        <w:rPr>
+          <w:sz w:val="32"/>
+          <w:szCs w:val="32"/>
+        </w:rPr>
+        <w:t>PureTarget</w:t>
+      </w:r>
+      <w:proofErr w:type="spellEnd"/>
       <w:r>
         <w:rPr>
           <w:sz w:val="32"/>
@@ -52,13 +61,29 @@
         <w:t xml:space="preserve">variant, structural variation, and </w:t>
       </w:r>
       <w:r>
-        <w:t>short tandem repeat (STR) genotyping performed using the PacBio PureTarget™ assay. Leveraging high-fidelity long-read sequencing and amplification-free target enrichment, this assay enables accurate characterization of pathogenic repeat expansions</w:t>
+        <w:t xml:space="preserve">short tandem repeat (STR) genotyping performed using the PacBio </w:t>
+      </w:r>
+      <w:proofErr w:type="spellStart"/>
+      <w:r>
+        <w:t>PureTarget</w:t>
+      </w:r>
+      <w:proofErr w:type="spellEnd"/>
+      <w:r>
+        <w:t>™ assay. Leveraging high-fidelity long-read sequencing and amplification-free target enrichment, this assay enables accurate characterization of pathogenic repeat expansions</w:t>
       </w:r>
       <w:r>
         <w:t xml:space="preserve"> and structural variations</w:t>
       </w:r>
       <w:r>
-        <w:t xml:space="preserve"> across a panel of genes implicated in neurodegenerative disease. These results are intended to support heathcare professionals in the diagnostic evaluation and genetic counseling process.</w:t>
+        <w:t xml:space="preserve"> across a panel of genes implicated in neurodegenerative disease. These results are intended to support </w:t>
+      </w:r>
+      <w:proofErr w:type="spellStart"/>
+      <w:r>
+        <w:t>heathcare</w:t>
+      </w:r>
+      <w:proofErr w:type="spellEnd"/>
+      <w:r>
+        <w:t xml:space="preserve"> professionals in the diagnostic evaluation and genetic counseling process.</w:t>
       </w:r>
     </w:p>
     <w:p>
@@ -136,14 +161,30 @@
                 <w:sz w:val="20"/>
                 <w:szCs w:val="20"/>
               </w:rPr>
-              <w:t>{#sampleState}</w:t>
-            </w:r>
-            <w:r>
-              <w:rPr>
-                <w:sz w:val="20"/>
-                <w:szCs w:val="20"/>
-              </w:rPr>
-              <w:t>Patient Name:</w:t>
+              <w:t>{#</w:t>
+            </w:r>
+            <w:proofErr w:type="gramStart"/>
+            <w:r>
+              <w:rPr>
+                <w:sz w:val="20"/>
+                <w:szCs w:val="20"/>
+              </w:rPr>
+              <w:t>sampleState}</w:t>
+            </w:r>
+            <w:r>
+              <w:rPr>
+                <w:sz w:val="20"/>
+                <w:szCs w:val="20"/>
+              </w:rPr>
+              <w:t>Patient</w:t>
+            </w:r>
+            <w:proofErr w:type="gramEnd"/>
+            <w:r>
+              <w:rPr>
+                <w:sz w:val="20"/>
+                <w:szCs w:val="20"/>
+              </w:rPr>
+              <w:t xml:space="preserve"> Name:</w:t>
             </w:r>
             <w:r>
               <w:rPr>
@@ -159,7 +200,27 @@
                 <w:sz w:val="20"/>
                 <w:szCs w:val="20"/>
               </w:rPr>
-              <w:t>{patientName}</w:t>
+              <w:t>{</w:t>
+            </w:r>
+            <w:proofErr w:type="spellStart"/>
+            <w:r>
+              <w:rPr>
+                <w:b/>
+                <w:bCs/>
+                <w:sz w:val="20"/>
+                <w:szCs w:val="20"/>
+              </w:rPr>
+              <w:t>patientName</w:t>
+            </w:r>
+            <w:proofErr w:type="spellEnd"/>
+            <w:r>
+              <w:rPr>
+                <w:b/>
+                <w:bCs/>
+                <w:sz w:val="20"/>
+                <w:szCs w:val="20"/>
+              </w:rPr>
+              <w:t>}</w:t>
             </w:r>
             <w:r>
               <w:rPr>
@@ -204,7 +265,27 @@
                 <w:sz w:val="20"/>
                 <w:szCs w:val="20"/>
               </w:rPr>
-              <w:t>{orderingPhysician}</w:t>
+              <w:t>{</w:t>
+            </w:r>
+            <w:proofErr w:type="spellStart"/>
+            <w:r>
+              <w:rPr>
+                <w:b/>
+                <w:bCs/>
+                <w:sz w:val="20"/>
+                <w:szCs w:val="20"/>
+              </w:rPr>
+              <w:t>orderingPhysician</w:t>
+            </w:r>
+            <w:proofErr w:type="spellEnd"/>
+            <w:r>
+              <w:rPr>
+                <w:b/>
+                <w:bCs/>
+                <w:sz w:val="20"/>
+                <w:szCs w:val="20"/>
+              </w:rPr>
+              <w:t>}</w:t>
             </w:r>
           </w:p>
         </w:tc>
@@ -245,7 +326,27 @@
                 <w:sz w:val="20"/>
                 <w:szCs w:val="20"/>
               </w:rPr>
-              <w:t>{specimenSite}</w:t>
+              <w:t>{</w:t>
+            </w:r>
+            <w:proofErr w:type="spellStart"/>
+            <w:r>
+              <w:rPr>
+                <w:b/>
+                <w:bCs/>
+                <w:sz w:val="20"/>
+                <w:szCs w:val="20"/>
+              </w:rPr>
+              <w:t>specimenSite</w:t>
+            </w:r>
+            <w:proofErr w:type="spellEnd"/>
+            <w:r>
+              <w:rPr>
+                <w:b/>
+                <w:bCs/>
+                <w:sz w:val="20"/>
+                <w:szCs w:val="20"/>
+              </w:rPr>
+              <w:t>}</w:t>
             </w:r>
           </w:p>
         </w:tc>
@@ -309,7 +410,15 @@
                 <w:sz w:val="20"/>
                 <w:szCs w:val="20"/>
               </w:rPr>
-              <w:t>Ordering Facility:</w:t>
+              <w:t xml:space="preserve">Ordering </w:t>
+            </w:r>
+            <w:proofErr w:type="gramStart"/>
+            <w:r>
+              <w:rPr>
+                <w:sz w:val="20"/>
+                <w:szCs w:val="20"/>
+              </w:rPr>
+              <w:t>Facility:</w:t>
             </w:r>
             <w:r>
               <w:rPr>
@@ -325,7 +434,17 @@
                 <w:sz w:val="20"/>
                 <w:szCs w:val="20"/>
               </w:rPr>
-              <w:t>{facility}</w:t>
+              <w:t>{</w:t>
+            </w:r>
+            <w:proofErr w:type="gramEnd"/>
+            <w:r>
+              <w:rPr>
+                <w:b/>
+                <w:bCs/>
+                <w:sz w:val="20"/>
+                <w:szCs w:val="20"/>
+              </w:rPr>
+              <w:t>facility}</w:t>
             </w:r>
           </w:p>
         </w:tc>
@@ -348,7 +467,15 @@
                 <w:sz w:val="20"/>
                 <w:szCs w:val="20"/>
               </w:rPr>
-              <w:t>Collection Date:</w:t>
+              <w:t xml:space="preserve">Collection </w:t>
+            </w:r>
+            <w:proofErr w:type="gramStart"/>
+            <w:r>
+              <w:rPr>
+                <w:sz w:val="20"/>
+                <w:szCs w:val="20"/>
+              </w:rPr>
+              <w:t>Date:</w:t>
             </w:r>
             <w:r>
               <w:rPr>
@@ -364,7 +491,28 @@
                 <w:sz w:val="20"/>
                 <w:szCs w:val="20"/>
               </w:rPr>
-              <w:t>{dateCollected}</w:t>
+              <w:t>{</w:t>
+            </w:r>
+            <w:proofErr w:type="spellStart"/>
+            <w:proofErr w:type="gramEnd"/>
+            <w:r>
+              <w:rPr>
+                <w:b/>
+                <w:bCs/>
+                <w:sz w:val="20"/>
+                <w:szCs w:val="20"/>
+              </w:rPr>
+              <w:t>dateCollected</w:t>
+            </w:r>
+            <w:proofErr w:type="spellEnd"/>
+            <w:r>
+              <w:rPr>
+                <w:b/>
+                <w:bCs/>
+                <w:sz w:val="20"/>
+                <w:szCs w:val="20"/>
+              </w:rPr>
+              <w:t>}</w:t>
             </w:r>
           </w:p>
         </w:tc>
@@ -435,7 +583,27 @@
                 <w:sz w:val="20"/>
                 <w:szCs w:val="20"/>
               </w:rPr>
-              <w:t>{contactPerson}</w:t>
+              <w:t>{</w:t>
+            </w:r>
+            <w:proofErr w:type="spellStart"/>
+            <w:r>
+              <w:rPr>
+                <w:b/>
+                <w:bCs/>
+                <w:sz w:val="20"/>
+                <w:szCs w:val="20"/>
+              </w:rPr>
+              <w:t>contactPerson</w:t>
+            </w:r>
+            <w:proofErr w:type="spellEnd"/>
+            <w:r>
+              <w:rPr>
+                <w:b/>
+                <w:bCs/>
+                <w:sz w:val="20"/>
+                <w:szCs w:val="20"/>
+              </w:rPr>
+              <w:t>}</w:t>
             </w:r>
           </w:p>
         </w:tc>
@@ -458,7 +626,15 @@
                 <w:sz w:val="20"/>
                 <w:szCs w:val="20"/>
               </w:rPr>
-              <w:t>Received Date:</w:t>
+              <w:t xml:space="preserve">Received </w:t>
+            </w:r>
+            <w:proofErr w:type="gramStart"/>
+            <w:r>
+              <w:rPr>
+                <w:sz w:val="20"/>
+                <w:szCs w:val="20"/>
+              </w:rPr>
+              <w:t>Date:</w:t>
             </w:r>
             <w:r>
               <w:rPr>
@@ -474,7 +650,28 @@
                 <w:sz w:val="20"/>
                 <w:szCs w:val="20"/>
               </w:rPr>
-              <w:t>{dateReceived}</w:t>
+              <w:t>{</w:t>
+            </w:r>
+            <w:proofErr w:type="spellStart"/>
+            <w:proofErr w:type="gramEnd"/>
+            <w:r>
+              <w:rPr>
+                <w:b/>
+                <w:bCs/>
+                <w:sz w:val="20"/>
+                <w:szCs w:val="20"/>
+              </w:rPr>
+              <w:t>dateReceived</w:t>
+            </w:r>
+            <w:proofErr w:type="spellEnd"/>
+            <w:r>
+              <w:rPr>
+                <w:b/>
+                <w:bCs/>
+                <w:sz w:val="20"/>
+                <w:szCs w:val="20"/>
+              </w:rPr>
+              <w:t>}</w:t>
             </w:r>
           </w:p>
         </w:tc>
@@ -507,7 +704,27 @@
                 <w:sz w:val="20"/>
                 <w:szCs w:val="20"/>
               </w:rPr>
-              <w:t>{reportDate}</w:t>
+              <w:t>{</w:t>
+            </w:r>
+            <w:proofErr w:type="spellStart"/>
+            <w:r>
+              <w:rPr>
+                <w:b/>
+                <w:bCs/>
+                <w:sz w:val="20"/>
+                <w:szCs w:val="20"/>
+              </w:rPr>
+              <w:t>reportDate</w:t>
+            </w:r>
+            <w:proofErr w:type="spellEnd"/>
+            <w:r>
+              <w:rPr>
+                <w:b/>
+                <w:bCs/>
+                <w:sz w:val="20"/>
+                <w:szCs w:val="20"/>
+              </w:rPr>
+              <w:t>}</w:t>
             </w:r>
           </w:p>
         </w:tc>
@@ -578,299 +795,26 @@
           <w:sz w:val="28"/>
           <w:szCs w:val="28"/>
         </w:rPr>
-        <w:t>Symbol Legend</w:t>
-      </w:r>
-    </w:p>
-    <w:tbl>
-      <w:tblPr>
-        <w:tblStyle w:val="TableGrid"/>
-        <w:tblW w:w="2700" w:type="dxa"/>
-        <w:tblBorders>
-          <w:top w:val="none" w:sz="0" w:space="0" w:color="auto"/>
-          <w:left w:val="none" w:sz="0" w:space="0" w:color="auto"/>
-          <w:bottom w:val="none" w:sz="0" w:space="0" w:color="auto"/>
-          <w:right w:val="none" w:sz="0" w:space="0" w:color="auto"/>
-          <w:insideV w:val="none" w:sz="0" w:space="0" w:color="auto"/>
-        </w:tblBorders>
-        <w:tblLayout w:type="fixed"/>
-        <w:tblLook w:val="04A0" w:firstRow="1" w:lastRow="0" w:firstColumn="1" w:lastColumn="0" w:noHBand="0" w:noVBand="1"/>
-      </w:tblPr>
-      <w:tblGrid>
-        <w:gridCol w:w="1792"/>
-        <w:gridCol w:w="908"/>
-      </w:tblGrid>
-      <w:tr>
-        <w:tc>
-          <w:tcPr>
-            <w:tcW w:w="1792" w:type="dxa"/>
-            <w:tcBorders>
-              <w:top w:val="nil"/>
-              <w:bottom w:val="single" w:sz="12" w:space="0" w:color="auto"/>
-            </w:tcBorders>
-          </w:tcPr>
-          <w:p>
-            <w:pPr>
-              <w:spacing w:line="360" w:lineRule="auto"/>
-              <w:rPr>
-                <w:rFonts w:cstheme="minorHAnsi"/>
-                <w:b/>
-                <w:bCs/>
-                <w:sz w:val="20"/>
-                <w:szCs w:val="20"/>
-              </w:rPr>
-            </w:pPr>
-            <w:r>
-              <w:rPr>
-                <w:rFonts w:cstheme="minorHAnsi"/>
-                <w:b/>
-                <w:bCs/>
-                <w:sz w:val="20"/>
-                <w:szCs w:val="20"/>
-              </w:rPr>
-              <w:t>Classification</w:t>
-            </w:r>
-          </w:p>
-        </w:tc>
-        <w:tc>
-          <w:tcPr>
-            <w:tcW w:w="908" w:type="dxa"/>
-            <w:tcBorders>
-              <w:top w:val="nil"/>
-              <w:bottom w:val="single" w:sz="12" w:space="0" w:color="auto"/>
-            </w:tcBorders>
-          </w:tcPr>
-          <w:p>
-            <w:pPr>
-              <w:spacing w:line="360" w:lineRule="auto"/>
-              <w:rPr>
-                <w:rFonts w:cstheme="minorHAnsi"/>
-                <w:b/>
-                <w:bCs/>
-                <w:sz w:val="20"/>
-                <w:szCs w:val="20"/>
-              </w:rPr>
-            </w:pPr>
-            <w:r>
-              <w:rPr>
-                <w:rFonts w:cstheme="minorHAnsi"/>
-                <w:b/>
-                <w:bCs/>
-                <w:sz w:val="20"/>
-                <w:szCs w:val="20"/>
-              </w:rPr>
-              <w:t>Symbol</w:t>
-            </w:r>
-          </w:p>
-        </w:tc>
-      </w:tr>
-      <w:tr>
-        <w:tc>
-          <w:tcPr>
-            <w:tcW w:w="1792" w:type="dxa"/>
-            <w:tcBorders>
-              <w:top w:val="single" w:sz="12" w:space="0" w:color="auto"/>
-              <w:bottom w:val="single" w:sz="4" w:space="0" w:color="A5A5A5" w:themeColor="accent3"/>
-            </w:tcBorders>
-          </w:tcPr>
-          <w:p>
-            <w:pPr>
-              <w:rPr>
-                <w:rFonts w:cstheme="minorHAnsi"/>
-                <w:sz w:val="20"/>
-                <w:szCs w:val="20"/>
-              </w:rPr>
-            </w:pPr>
-            <w:r>
-              <w:rPr>
-                <w:rFonts w:cstheme="minorHAnsi"/>
-                <w:sz w:val="20"/>
-                <w:szCs w:val="20"/>
-              </w:rPr>
-              <w:t>Pathogenic</w:t>
-            </w:r>
-          </w:p>
-        </w:tc>
-        <w:tc>
-          <w:tcPr>
-            <w:tcW w:w="908" w:type="dxa"/>
-            <w:tcBorders>
-              <w:top w:val="single" w:sz="12" w:space="0" w:color="auto"/>
-              <w:bottom w:val="single" w:sz="4" w:space="0" w:color="A5A5A5" w:themeColor="accent3"/>
-            </w:tcBorders>
-          </w:tcPr>
-          <w:p>
-            <w:pPr>
-              <w:jc w:val="center"/>
-              <w:rPr>
-                <w:rFonts w:cstheme="minorHAnsi"/>
-                <w:sz w:val="20"/>
-                <w:szCs w:val="20"/>
-              </w:rPr>
-            </w:pPr>
-            <w:r>
-              <w:rPr>
-                <w:rFonts w:cstheme="minorHAnsi"/>
-                <w:color w:val="DD537A"/>
-                <w:sz w:val="20"/>
-                <w:szCs w:val="20"/>
-              </w:rPr>
-              <w:t>⊘</w:t>
-            </w:r>
-          </w:p>
-        </w:tc>
-      </w:tr>
-      <w:tr>
-        <w:tc>
-          <w:tcPr>
-            <w:tcW w:w="1792" w:type="dxa"/>
-            <w:tcBorders>
-              <w:top w:val="single" w:sz="12" w:space="0" w:color="auto"/>
-              <w:bottom w:val="single" w:sz="4" w:space="0" w:color="A5A5A5" w:themeColor="accent3"/>
-            </w:tcBorders>
-          </w:tcPr>
-          <w:p>
-            <w:pPr>
-              <w:rPr>
-                <w:rFonts w:cstheme="minorHAnsi"/>
-                <w:sz w:val="20"/>
-                <w:szCs w:val="20"/>
-              </w:rPr>
-            </w:pPr>
-            <w:r>
-              <w:rPr>
-                <w:rFonts w:cstheme="minorHAnsi"/>
-                <w:sz w:val="20"/>
-                <w:szCs w:val="20"/>
-              </w:rPr>
-              <w:t>Intermediate</w:t>
-            </w:r>
-          </w:p>
-        </w:tc>
-        <w:tc>
-          <w:tcPr>
-            <w:tcW w:w="908" w:type="dxa"/>
-            <w:tcBorders>
-              <w:top w:val="single" w:sz="12" w:space="0" w:color="auto"/>
-              <w:bottom w:val="single" w:sz="4" w:space="0" w:color="A5A5A5" w:themeColor="accent3"/>
-            </w:tcBorders>
-          </w:tcPr>
-          <w:p>
-            <w:pPr>
-              <w:jc w:val="center"/>
-              <w:rPr>
-                <w:rFonts w:cstheme="minorHAnsi"/>
-                <w:sz w:val="20"/>
-                <w:szCs w:val="20"/>
-              </w:rPr>
-            </w:pPr>
-            <w:r>
-              <w:rPr>
-                <w:rFonts w:cstheme="minorHAnsi"/>
-                <w:color w:val="FFC35C"/>
-                <w:sz w:val="20"/>
-                <w:szCs w:val="20"/>
-              </w:rPr>
-              <w:t>⚠</w:t>
-            </w:r>
-          </w:p>
-        </w:tc>
-      </w:tr>
-      <w:tr>
-        <w:tc>
-          <w:tcPr>
-            <w:tcW w:w="1792" w:type="dxa"/>
-            <w:tcBorders>
-              <w:top w:val="single" w:sz="12" w:space="0" w:color="auto"/>
-              <w:bottom w:val="single" w:sz="4" w:space="0" w:color="A5A5A5" w:themeColor="accent3"/>
-            </w:tcBorders>
-          </w:tcPr>
-          <w:p>
-            <w:pPr>
-              <w:rPr>
-                <w:rFonts w:cstheme="minorHAnsi"/>
-                <w:sz w:val="20"/>
-                <w:szCs w:val="20"/>
-              </w:rPr>
-            </w:pPr>
-            <w:r>
-              <w:rPr>
-                <w:rFonts w:cstheme="minorHAnsi"/>
-                <w:sz w:val="20"/>
-                <w:szCs w:val="20"/>
-              </w:rPr>
-              <w:t>Benign</w:t>
-            </w:r>
-          </w:p>
-        </w:tc>
-        <w:tc>
-          <w:tcPr>
-            <w:tcW w:w="908" w:type="dxa"/>
-            <w:tcBorders>
-              <w:top w:val="single" w:sz="12" w:space="0" w:color="auto"/>
-              <w:bottom w:val="single" w:sz="4" w:space="0" w:color="A5A5A5" w:themeColor="accent3"/>
-            </w:tcBorders>
-          </w:tcPr>
-          <w:p>
-            <w:pPr>
-              <w:jc w:val="center"/>
-              <w:rPr>
-                <w:rFonts w:cstheme="minorHAnsi"/>
-                <w:sz w:val="20"/>
-                <w:szCs w:val="20"/>
-              </w:rPr>
-            </w:pPr>
-            <w:r>
-              <w:rPr>
-                <w:rFonts w:cstheme="minorHAnsi"/>
-                <w:color w:val="8DCC56"/>
-                <w:sz w:val="20"/>
-                <w:szCs w:val="20"/>
-              </w:rPr>
-              <w:t>✓</w:t>
-            </w:r>
-          </w:p>
-        </w:tc>
-      </w:tr>
-    </w:tbl>
-    <w:p>
-      <w:pPr>
-        <w:pBdr>
-          <w:bottom w:val="single" w:sz="4" w:space="1" w:color="auto"/>
-        </w:pBdr>
+        <w:t>{#</w:t>
+      </w:r>
+      <w:proofErr w:type="gramStart"/>
+      <w:r>
         <w:rPr>
           <w:color w:val="4472C4" w:themeColor="accent1"/>
           <w:sz w:val="28"/>
           <w:szCs w:val="28"/>
         </w:rPr>
-      </w:pPr>
-    </w:p>
-    <w:p>
-      <w:pPr>
-        <w:pBdr>
-          <w:bottom w:val="single" w:sz="4" w:space="1" w:color="auto"/>
-        </w:pBdr>
-        <w:rPr>
-          <w:rFonts w:cstheme="minorHAnsi"/>
-          <w:sz w:val="20"/>
-          <w:szCs w:val="20"/>
-        </w:rPr>
-      </w:pPr>
+        <w:t>smallVariants.length}</w:t>
+      </w:r>
       <w:r>
         <w:rPr>
           <w:color w:val="4472C4" w:themeColor="accent1"/>
           <w:sz w:val="28"/>
           <w:szCs w:val="28"/>
         </w:rPr>
-        <w:t>{#smallVariants.length}</w:t>
-      </w:r>
-      <w:r>
-        <w:rPr>
-          <w:color w:val="4472C4" w:themeColor="accent1"/>
-          <w:sz w:val="28"/>
-          <w:szCs w:val="28"/>
-        </w:rPr>
         <w:t>Variant</w:t>
       </w:r>
+      <w:proofErr w:type="gramEnd"/>
       <w:r>
         <w:rPr>
           <w:color w:val="4472C4" w:themeColor="accent1"/>
@@ -1083,6 +1027,7 @@
               </w:rPr>
               <w:t>{#</w:t>
             </w:r>
+            <w:proofErr w:type="gramStart"/>
             <w:r>
               <w:rPr>
                 <w:color w:val="000000" w:themeColor="text1"/>
@@ -1099,6 +1044,7 @@
               </w:rPr>
               <w:t>ariants}{</w:t>
             </w:r>
+            <w:proofErr w:type="gramEnd"/>
             <w:r>
               <w:rPr>
                 <w:color w:val="000000" w:themeColor="text1"/>
@@ -1259,6 +1205,7 @@
               </w:rPr>
               <w:t>~</w:t>
             </w:r>
+            <w:proofErr w:type="spellStart"/>
             <w:r>
               <w:rPr>
                 <w:color w:val="000000" w:themeColor="text1"/>
@@ -1283,6 +1230,7 @@
               </w:rPr>
               <w:t>|</w:t>
             </w:r>
+            <w:proofErr w:type="gramStart"/>
             <w:r>
               <w:rPr>
                 <w:color w:val="000000" w:themeColor="text1"/>
@@ -1299,13 +1247,23 @@
               </w:rPr>
               <w:t>Classification</w:t>
             </w:r>
-            <w:r>
-              <w:rPr>
-                <w:color w:val="000000" w:themeColor="text1"/>
-                <w:sz w:val="20"/>
-                <w:szCs w:val="20"/>
-              </w:rPr>
-              <w:t>}{/}</w:t>
+            <w:proofErr w:type="spellEnd"/>
+            <w:r>
+              <w:rPr>
+                <w:color w:val="000000" w:themeColor="text1"/>
+                <w:sz w:val="20"/>
+                <w:szCs w:val="20"/>
+              </w:rPr>
+              <w:t>}{</w:t>
+            </w:r>
+            <w:proofErr w:type="gramEnd"/>
+            <w:r>
+              <w:rPr>
+                <w:color w:val="000000" w:themeColor="text1"/>
+                <w:sz w:val="20"/>
+                <w:szCs w:val="20"/>
+              </w:rPr>
+              <w:t>/}</w:t>
             </w:r>
           </w:p>
         </w:tc>
@@ -1338,15 +1296,16 @@
           <w:sz w:val="28"/>
           <w:szCs w:val="28"/>
         </w:rPr>
-        <w:t>{/}</w:t>
-      </w:r>
+        <w:t>{</w:t>
+      </w:r>
+      <w:proofErr w:type="gramStart"/>
       <w:r>
         <w:rPr>
           <w:color w:val="4472C4" w:themeColor="accent1"/>
           <w:sz w:val="28"/>
           <w:szCs w:val="28"/>
         </w:rPr>
-        <w:t>{#</w:t>
+        <w:t>/}</w:t>
       </w:r>
       <w:r>
         <w:rPr>
@@ -1354,23 +1313,50 @@
           <w:sz w:val="28"/>
           <w:szCs w:val="28"/>
         </w:rPr>
-        <w:t>structural</w:t>
-      </w:r>
+        <w:t>{</w:t>
+      </w:r>
+      <w:proofErr w:type="gramEnd"/>
       <w:r>
         <w:rPr>
           <w:color w:val="4472C4" w:themeColor="accent1"/>
           <w:sz w:val="28"/>
           <w:szCs w:val="28"/>
         </w:rPr>
-        <w:t>Variants.length}</w:t>
-      </w:r>
+        <w:t>#</w:t>
+      </w:r>
+      <w:proofErr w:type="gramStart"/>
       <w:r>
         <w:rPr>
           <w:color w:val="4472C4" w:themeColor="accent1"/>
           <w:sz w:val="28"/>
           <w:szCs w:val="28"/>
         </w:rPr>
-        <w:t>Structural Variant</w:t>
+        <w:t>structural</w:t>
+      </w:r>
+      <w:r>
+        <w:rPr>
+          <w:color w:val="4472C4" w:themeColor="accent1"/>
+          <w:sz w:val="28"/>
+          <w:szCs w:val="28"/>
+        </w:rPr>
+        <w:t>Variants.length}</w:t>
+      </w:r>
+      <w:r>
+        <w:rPr>
+          <w:color w:val="4472C4" w:themeColor="accent1"/>
+          <w:sz w:val="28"/>
+          <w:szCs w:val="28"/>
+        </w:rPr>
+        <w:t>Structural</w:t>
+      </w:r>
+      <w:proofErr w:type="gramEnd"/>
+      <w:r>
+        <w:rPr>
+          <w:color w:val="4472C4" w:themeColor="accent1"/>
+          <w:sz w:val="28"/>
+          <w:szCs w:val="28"/>
+        </w:rPr>
+        <w:t xml:space="preserve"> Variant</w:t>
       </w:r>
       <w:r>
         <w:rPr>
@@ -1530,6 +1516,7 @@
               </w:rPr>
               <w:t>{#</w:t>
             </w:r>
+            <w:proofErr w:type="gramStart"/>
             <w:r>
               <w:rPr>
                 <w:color w:val="000000" w:themeColor="text1"/>
@@ -1546,6 +1533,7 @@
               </w:rPr>
               <w:t>ariants}{</w:t>
             </w:r>
+            <w:proofErr w:type="gramEnd"/>
             <w:r>
               <w:rPr>
                 <w:color w:val="000000" w:themeColor="text1"/>
@@ -1588,6 +1576,7 @@
               </w:rPr>
               <w:t>{</w:t>
             </w:r>
+            <w:proofErr w:type="spellStart"/>
             <w:r>
               <w:rPr>
                 <w:color w:val="000000" w:themeColor="text1"/>
@@ -1596,6 +1585,7 @@
               </w:rPr>
               <w:t>svType</w:t>
             </w:r>
+            <w:proofErr w:type="spellEnd"/>
             <w:r>
               <w:rPr>
                 <w:color w:val="000000" w:themeColor="text1"/>
@@ -1638,6 +1628,7 @@
               </w:rPr>
               <w:t>~</w:t>
             </w:r>
+            <w:proofErr w:type="spellStart"/>
             <w:r>
               <w:rPr>
                 <w:color w:val="000000" w:themeColor="text1"/>
@@ -1652,8 +1643,18 @@
                 <w:sz w:val="20"/>
                 <w:szCs w:val="20"/>
               </w:rPr>
-              <w:t>|formatClassification</w:t>
-            </w:r>
+              <w:t>|</w:t>
+            </w:r>
+            <w:proofErr w:type="gramStart"/>
+            <w:r>
+              <w:rPr>
+                <w:color w:val="000000" w:themeColor="text1"/>
+                <w:sz w:val="20"/>
+                <w:szCs w:val="20"/>
+              </w:rPr>
+              <w:t>formatClassification</w:t>
+            </w:r>
+            <w:proofErr w:type="spellEnd"/>
             <w:r>
               <w:rPr>
                 <w:color w:val="000000" w:themeColor="text1"/>
@@ -1668,7 +1669,16 @@
                 <w:sz w:val="20"/>
                 <w:szCs w:val="20"/>
               </w:rPr>
-              <w:t>{/}</w:t>
+              <w:t>{</w:t>
+            </w:r>
+            <w:proofErr w:type="gramEnd"/>
+            <w:r>
+              <w:rPr>
+                <w:color w:val="000000" w:themeColor="text1"/>
+                <w:sz w:val="20"/>
+                <w:szCs w:val="20"/>
+              </w:rPr>
+              <w:t>/}</w:t>
             </w:r>
           </w:p>
         </w:tc>
@@ -1701,15 +1711,16 @@
           <w:sz w:val="28"/>
           <w:szCs w:val="28"/>
         </w:rPr>
-        <w:t>{/}</w:t>
-      </w:r>
+        <w:t>{</w:t>
+      </w:r>
+      <w:proofErr w:type="gramStart"/>
       <w:r>
         <w:rPr>
           <w:color w:val="4472C4" w:themeColor="accent1"/>
           <w:sz w:val="28"/>
           <w:szCs w:val="28"/>
         </w:rPr>
-        <w:t>{#strGenotypes.length}</w:t>
+        <w:t>/}</w:t>
       </w:r>
       <w:r>
         <w:rPr>
@@ -1717,15 +1728,50 @@
           <w:sz w:val="28"/>
           <w:szCs w:val="28"/>
         </w:rPr>
-        <w:t>T</w:t>
-      </w:r>
+        <w:t>{</w:t>
+      </w:r>
+      <w:proofErr w:type="gramEnd"/>
       <w:r>
         <w:rPr>
           <w:color w:val="4472C4" w:themeColor="accent1"/>
           <w:sz w:val="28"/>
           <w:szCs w:val="28"/>
         </w:rPr>
-        <w:t>andem Repeat</w:t>
+        <w:t>#</w:t>
+      </w:r>
+      <w:proofErr w:type="gramStart"/>
+      <w:r>
+        <w:rPr>
+          <w:color w:val="4472C4" w:themeColor="accent1"/>
+          <w:sz w:val="28"/>
+          <w:szCs w:val="28"/>
+        </w:rPr>
+        <w:t>strGenotypes.length}</w:t>
+      </w:r>
+      <w:r>
+        <w:rPr>
+          <w:color w:val="4472C4" w:themeColor="accent1"/>
+          <w:sz w:val="28"/>
+          <w:szCs w:val="28"/>
+        </w:rPr>
+        <w:t>T</w:t>
+      </w:r>
+      <w:r>
+        <w:rPr>
+          <w:color w:val="4472C4" w:themeColor="accent1"/>
+          <w:sz w:val="28"/>
+          <w:szCs w:val="28"/>
+        </w:rPr>
+        <w:t>andem</w:t>
+      </w:r>
+      <w:proofErr w:type="gramEnd"/>
+      <w:r>
+        <w:rPr>
+          <w:color w:val="4472C4" w:themeColor="accent1"/>
+          <w:sz w:val="28"/>
+          <w:szCs w:val="28"/>
+        </w:rPr>
+        <w:t xml:space="preserve"> Repeat</w:t>
       </w:r>
       <w:r>
         <w:rPr>
@@ -1981,23 +2027,33 @@
                 <w:sz w:val="20"/>
                 <w:szCs w:val="20"/>
               </w:rPr>
-              <w:t>{#strGenotypes}{</w:t>
-            </w:r>
-            <w:r>
-              <w:rPr>
-                <w:rFonts w:cstheme="minorHAnsi"/>
-                <w:sz w:val="20"/>
-                <w:szCs w:val="20"/>
-              </w:rPr>
-              <w:t>g</w:t>
-            </w:r>
-            <w:r>
-              <w:rPr>
-                <w:rFonts w:cstheme="minorHAnsi"/>
-                <w:sz w:val="20"/>
-                <w:szCs w:val="20"/>
-              </w:rPr>
-              <w:t>ene}</w:t>
+              <w:t>{#</w:t>
+            </w:r>
+            <w:proofErr w:type="gramStart"/>
+            <w:r>
+              <w:rPr>
+                <w:rFonts w:cstheme="minorHAnsi"/>
+                <w:sz w:val="20"/>
+                <w:szCs w:val="20"/>
+              </w:rPr>
+              <w:t>strGenotypes}{</w:t>
+            </w:r>
+            <w:proofErr w:type="gramEnd"/>
+            <w:r>
+              <w:rPr>
+                <w:rFonts w:cstheme="minorHAnsi"/>
+                <w:sz w:val="20"/>
+                <w:szCs w:val="20"/>
+              </w:rPr>
+              <w:t>trid</w:t>
+            </w:r>
+            <w:r>
+              <w:rPr>
+                <w:rFonts w:cstheme="minorHAnsi"/>
+                <w:sz w:val="20"/>
+                <w:szCs w:val="20"/>
+              </w:rPr>
+              <w:t>}</w:t>
             </w:r>
           </w:p>
         </w:tc>
@@ -2109,6 +2165,7 @@
               </w:rPr>
               <w:t>{</w:t>
             </w:r>
+            <w:proofErr w:type="spellStart"/>
             <w:r>
               <w:rPr>
                 <w:rFonts w:cstheme="minorHAnsi"/>
@@ -2123,7 +2180,16 @@
                 <w:sz w:val="20"/>
                 <w:szCs w:val="20"/>
               </w:rPr>
-              <w:t>eadDepth}</w:t>
+              <w:t>eadDepth</w:t>
+            </w:r>
+            <w:proofErr w:type="spellEnd"/>
+            <w:r>
+              <w:rPr>
+                <w:rFonts w:cstheme="minorHAnsi"/>
+                <w:sz w:val="20"/>
+                <w:szCs w:val="20"/>
+              </w:rPr>
+              <w:t>}</w:t>
             </w:r>
           </w:p>
         </w:tc>
@@ -2277,6 +2343,8 @@
               </w:rPr>
               <w:t>{~~</w:t>
             </w:r>
+            <w:proofErr w:type="spellStart"/>
+            <w:proofErr w:type="gramStart"/>
             <w:r>
               <w:rPr>
                 <w:rFonts w:cstheme="minorHAnsi"/>
@@ -2301,13 +2369,23 @@
               </w:rPr>
               <w:t>Html</w:t>
             </w:r>
-            <w:r>
-              <w:rPr>
-                <w:rFonts w:cstheme="minorHAnsi"/>
-                <w:sz w:val="20"/>
-                <w:szCs w:val="20"/>
-              </w:rPr>
-              <w:t>}{/}</w:t>
+            <w:proofErr w:type="spellEnd"/>
+            <w:r>
+              <w:rPr>
+                <w:rFonts w:cstheme="minorHAnsi"/>
+                <w:sz w:val="20"/>
+                <w:szCs w:val="20"/>
+              </w:rPr>
+              <w:t>}{</w:t>
+            </w:r>
+            <w:proofErr w:type="gramEnd"/>
+            <w:r>
+              <w:rPr>
+                <w:rFonts w:cstheme="minorHAnsi"/>
+                <w:sz w:val="20"/>
+                <w:szCs w:val="20"/>
+              </w:rPr>
+              <w:t>/}</w:t>
             </w:r>
           </w:p>
         </w:tc>
@@ -2319,6 +2397,283 @@
           <w:rFonts w:cstheme="minorHAnsi"/>
           <w:sz w:val="20"/>
           <w:szCs w:val="20"/>
+        </w:rPr>
+      </w:pPr>
+    </w:p>
+    <w:p>
+      <w:pPr>
+        <w:rPr>
+          <w:rFonts w:cstheme="minorHAnsi"/>
+          <w:sz w:val="24"/>
+          <w:szCs w:val="24"/>
+        </w:rPr>
+      </w:pPr>
+      <w:r>
+        <w:rPr>
+          <w:rFonts w:cstheme="minorHAnsi"/>
+          <w:sz w:val="24"/>
+          <w:szCs w:val="24"/>
+        </w:rPr>
+        <w:t>Symbol Legend</w:t>
+      </w:r>
+    </w:p>
+    <w:tbl>
+      <w:tblPr>
+        <w:tblStyle w:val="TableGrid"/>
+        <w:tblW w:w="2700" w:type="dxa"/>
+        <w:tblBorders>
+          <w:top w:val="none" w:sz="0" w:space="0" w:color="auto"/>
+          <w:left w:val="none" w:sz="0" w:space="0" w:color="auto"/>
+          <w:bottom w:val="none" w:sz="0" w:space="0" w:color="auto"/>
+          <w:right w:val="none" w:sz="0" w:space="0" w:color="auto"/>
+          <w:insideV w:val="none" w:sz="0" w:space="0" w:color="auto"/>
+        </w:tblBorders>
+        <w:tblLayout w:type="fixed"/>
+        <w:tblLook w:val="04A0" w:firstRow="1" w:lastRow="0" w:firstColumn="1" w:lastColumn="0" w:noHBand="0" w:noVBand="1"/>
+      </w:tblPr>
+      <w:tblGrid>
+        <w:gridCol w:w="1792"/>
+        <w:gridCol w:w="908"/>
+      </w:tblGrid>
+      <w:tr>
+        <w:tc>
+          <w:tcPr>
+            <w:tcW w:w="1792" w:type="dxa"/>
+            <w:tcBorders>
+              <w:top w:val="nil"/>
+              <w:bottom w:val="single" w:sz="12" w:space="0" w:color="auto"/>
+            </w:tcBorders>
+          </w:tcPr>
+          <w:p>
+            <w:pPr>
+              <w:spacing w:line="360" w:lineRule="auto"/>
+              <w:rPr>
+                <w:rFonts w:cstheme="minorHAnsi"/>
+                <w:b/>
+                <w:bCs/>
+                <w:sz w:val="20"/>
+                <w:szCs w:val="20"/>
+              </w:rPr>
+            </w:pPr>
+            <w:r>
+              <w:rPr>
+                <w:rFonts w:cstheme="minorHAnsi"/>
+                <w:b/>
+                <w:bCs/>
+                <w:sz w:val="20"/>
+                <w:szCs w:val="20"/>
+              </w:rPr>
+              <w:t>Classification</w:t>
+            </w:r>
+          </w:p>
+        </w:tc>
+        <w:tc>
+          <w:tcPr>
+            <w:tcW w:w="908" w:type="dxa"/>
+            <w:tcBorders>
+              <w:top w:val="nil"/>
+              <w:bottom w:val="single" w:sz="12" w:space="0" w:color="auto"/>
+            </w:tcBorders>
+          </w:tcPr>
+          <w:p>
+            <w:pPr>
+              <w:spacing w:line="360" w:lineRule="auto"/>
+              <w:rPr>
+                <w:rFonts w:cstheme="minorHAnsi"/>
+                <w:b/>
+                <w:bCs/>
+                <w:sz w:val="20"/>
+                <w:szCs w:val="20"/>
+              </w:rPr>
+            </w:pPr>
+            <w:r>
+              <w:rPr>
+                <w:rFonts w:cstheme="minorHAnsi"/>
+                <w:b/>
+                <w:bCs/>
+                <w:sz w:val="20"/>
+                <w:szCs w:val="20"/>
+              </w:rPr>
+              <w:t>Symbol</w:t>
+            </w:r>
+          </w:p>
+        </w:tc>
+      </w:tr>
+      <w:tr>
+        <w:tc>
+          <w:tcPr>
+            <w:tcW w:w="1792" w:type="dxa"/>
+            <w:tcBorders>
+              <w:top w:val="single" w:sz="12" w:space="0" w:color="auto"/>
+              <w:bottom w:val="single" w:sz="4" w:space="0" w:color="A5A5A5" w:themeColor="accent3"/>
+            </w:tcBorders>
+          </w:tcPr>
+          <w:p>
+            <w:pPr>
+              <w:rPr>
+                <w:rFonts w:cstheme="minorHAnsi"/>
+                <w:sz w:val="20"/>
+                <w:szCs w:val="20"/>
+              </w:rPr>
+            </w:pPr>
+            <w:r>
+              <w:rPr>
+                <w:rFonts w:cstheme="minorHAnsi"/>
+                <w:sz w:val="20"/>
+                <w:szCs w:val="20"/>
+              </w:rPr>
+              <w:t>Pathogenic</w:t>
+            </w:r>
+          </w:p>
+        </w:tc>
+        <w:tc>
+          <w:tcPr>
+            <w:tcW w:w="908" w:type="dxa"/>
+            <w:tcBorders>
+              <w:top w:val="single" w:sz="12" w:space="0" w:color="auto"/>
+              <w:bottom w:val="single" w:sz="4" w:space="0" w:color="A5A5A5" w:themeColor="accent3"/>
+            </w:tcBorders>
+          </w:tcPr>
+          <w:p>
+            <w:pPr>
+              <w:jc w:val="center"/>
+              <w:rPr>
+                <w:rFonts w:cstheme="minorHAnsi"/>
+                <w:sz w:val="20"/>
+                <w:szCs w:val="20"/>
+              </w:rPr>
+            </w:pPr>
+            <w:r>
+              <w:rPr>
+                <w:rFonts w:cstheme="minorHAnsi"/>
+                <w:color w:val="DD537A"/>
+                <w:sz w:val="20"/>
+                <w:szCs w:val="20"/>
+              </w:rPr>
+              <w:t>⊘</w:t>
+            </w:r>
+          </w:p>
+        </w:tc>
+      </w:tr>
+      <w:tr>
+        <w:tc>
+          <w:tcPr>
+            <w:tcW w:w="1792" w:type="dxa"/>
+            <w:tcBorders>
+              <w:top w:val="single" w:sz="12" w:space="0" w:color="auto"/>
+              <w:bottom w:val="single" w:sz="4" w:space="0" w:color="A5A5A5" w:themeColor="accent3"/>
+            </w:tcBorders>
+          </w:tcPr>
+          <w:p>
+            <w:pPr>
+              <w:rPr>
+                <w:rFonts w:cstheme="minorHAnsi"/>
+                <w:sz w:val="20"/>
+                <w:szCs w:val="20"/>
+              </w:rPr>
+            </w:pPr>
+            <w:r>
+              <w:rPr>
+                <w:rFonts w:cstheme="minorHAnsi"/>
+                <w:sz w:val="20"/>
+                <w:szCs w:val="20"/>
+              </w:rPr>
+              <w:t>Intermediate</w:t>
+            </w:r>
+          </w:p>
+        </w:tc>
+        <w:tc>
+          <w:tcPr>
+            <w:tcW w:w="908" w:type="dxa"/>
+            <w:tcBorders>
+              <w:top w:val="single" w:sz="12" w:space="0" w:color="auto"/>
+              <w:bottom w:val="single" w:sz="4" w:space="0" w:color="A5A5A5" w:themeColor="accent3"/>
+            </w:tcBorders>
+          </w:tcPr>
+          <w:p>
+            <w:pPr>
+              <w:jc w:val="center"/>
+              <w:rPr>
+                <w:rFonts w:cstheme="minorHAnsi"/>
+                <w:sz w:val="20"/>
+                <w:szCs w:val="20"/>
+              </w:rPr>
+            </w:pPr>
+            <w:r>
+              <w:rPr>
+                <w:rFonts w:cstheme="minorHAnsi"/>
+                <w:color w:val="FFC35C"/>
+                <w:sz w:val="20"/>
+                <w:szCs w:val="20"/>
+              </w:rPr>
+              <w:t>⚠</w:t>
+            </w:r>
+          </w:p>
+        </w:tc>
+      </w:tr>
+      <w:tr>
+        <w:tc>
+          <w:tcPr>
+            <w:tcW w:w="1792" w:type="dxa"/>
+            <w:tcBorders>
+              <w:top w:val="single" w:sz="12" w:space="0" w:color="auto"/>
+              <w:bottom w:val="single" w:sz="4" w:space="0" w:color="A5A5A5" w:themeColor="accent3"/>
+            </w:tcBorders>
+          </w:tcPr>
+          <w:p>
+            <w:pPr>
+              <w:rPr>
+                <w:rFonts w:cstheme="minorHAnsi"/>
+                <w:sz w:val="20"/>
+                <w:szCs w:val="20"/>
+              </w:rPr>
+            </w:pPr>
+            <w:r>
+              <w:rPr>
+                <w:rFonts w:cstheme="minorHAnsi"/>
+                <w:sz w:val="20"/>
+                <w:szCs w:val="20"/>
+              </w:rPr>
+              <w:t>Benign</w:t>
+            </w:r>
+          </w:p>
+        </w:tc>
+        <w:tc>
+          <w:tcPr>
+            <w:tcW w:w="908" w:type="dxa"/>
+            <w:tcBorders>
+              <w:top w:val="single" w:sz="12" w:space="0" w:color="auto"/>
+              <w:bottom w:val="single" w:sz="4" w:space="0" w:color="A5A5A5" w:themeColor="accent3"/>
+            </w:tcBorders>
+          </w:tcPr>
+          <w:p>
+            <w:pPr>
+              <w:jc w:val="center"/>
+              <w:rPr>
+                <w:rFonts w:cstheme="minorHAnsi"/>
+                <w:sz w:val="20"/>
+                <w:szCs w:val="20"/>
+              </w:rPr>
+            </w:pPr>
+            <w:r>
+              <w:rPr>
+                <w:rFonts w:cstheme="minorHAnsi"/>
+                <w:color w:val="8DCC56"/>
+                <w:sz w:val="20"/>
+                <w:szCs w:val="20"/>
+              </w:rPr>
+              <w:t>✓</w:t>
+            </w:r>
+          </w:p>
+        </w:tc>
+      </w:tr>
+    </w:tbl>
+    <w:p>
+      <w:pPr>
+        <w:rPr>
+          <w:rFonts w:cstheme="minorHAnsi"/>
+          <w:sz w:val="24"/>
+          <w:szCs w:val="24"/>
         </w:rPr>
       </w:pPr>
     </w:p>
@@ -2339,16 +2694,33 @@
           <w:sz w:val="28"/>
           <w:szCs w:val="28"/>
         </w:rPr>
-        <w:lastRenderedPageBreak/>
-        <w:t>{/}</w:t>
-      </w:r>
+        <w:t>{</w:t>
+      </w:r>
+      <w:proofErr w:type="gramStart"/>
       <w:r>
         <w:rPr>
           <w:color w:val="4472C4" w:themeColor="accent1"/>
           <w:sz w:val="28"/>
           <w:szCs w:val="28"/>
         </w:rPr>
-        <w:t>Primary Findings</w:t>
+        <w:t>/}</w:t>
+      </w:r>
+      <w:r>
+        <w:rPr>
+          <w:color w:val="4472C4" w:themeColor="accent1"/>
+          <w:sz w:val="28"/>
+          <w:szCs w:val="28"/>
+        </w:rPr>
+        <w:t>Primary</w:t>
+      </w:r>
+      <w:proofErr w:type="gramEnd"/>
+      <w:r>
+        <w:rPr>
+          <w:color w:val="4472C4" w:themeColor="accent1"/>
+          <w:sz w:val="28"/>
+          <w:szCs w:val="28"/>
+        </w:rPr>
+        <w:t xml:space="preserve"> Findings</w:t>
       </w:r>
     </w:p>
     <w:p>
@@ -2366,14 +2738,31 @@
           <w:sz w:val="20"/>
           <w:szCs w:val="20"/>
         </w:rPr>
-        <w:t>{#noSignificantFindings}</w:t>
-      </w:r>
-      <w:r>
-        <w:rPr>
-          <w:sz w:val="20"/>
-          <w:szCs w:val="20"/>
-        </w:rPr>
-        <w:t>No clinically significant variants were detected. This result does not exclude the possibility of variants outside the tested regions, variants below the detection threshold of this assay, or other types of genetic alterations not assessed by this assay.</w:t>
+        <w:lastRenderedPageBreak/>
+        <w:t>{#</w:t>
+      </w:r>
+      <w:proofErr w:type="gramStart"/>
+      <w:r>
+        <w:rPr>
+          <w:sz w:val="20"/>
+          <w:szCs w:val="20"/>
+        </w:rPr>
+        <w:t>noSignificantFindings}</w:t>
+      </w:r>
+      <w:r>
+        <w:rPr>
+          <w:sz w:val="20"/>
+          <w:szCs w:val="20"/>
+        </w:rPr>
+        <w:t>No</w:t>
+      </w:r>
+      <w:proofErr w:type="gramEnd"/>
+      <w:r>
+        <w:rPr>
+          <w:sz w:val="20"/>
+          <w:szCs w:val="20"/>
+        </w:rPr>
+        <w:t xml:space="preserve"> clinically significant variants were detected. This result does not exclude the possibility of variants outside the tested regions, variants below the detection threshold of this assay, or other types of genetic alterations not assessed by this assay.</w:t>
       </w:r>
     </w:p>
     <w:p>
@@ -2395,8 +2784,9 @@
           <w:sz w:val="28"/>
           <w:szCs w:val="28"/>
         </w:rPr>
-        <w:t>{/}</w:t>
-      </w:r>
+        <w:t>{</w:t>
+      </w:r>
+      <w:proofErr w:type="gramStart"/>
       <w:r>
         <w:rPr>
           <w:b/>
@@ -2404,7 +2794,7 @@
           <w:sz w:val="28"/>
           <w:szCs w:val="28"/>
         </w:rPr>
-        <w:t>{#</w:t>
+        <w:t>/}</w:t>
       </w:r>
       <w:r>
         <w:rPr>
@@ -2413,8 +2803,9 @@
           <w:sz w:val="28"/>
           <w:szCs w:val="28"/>
         </w:rPr>
-        <w:t>reportedRegionDetails</w:t>
-      </w:r>
+        <w:t>{</w:t>
+      </w:r>
+      <w:proofErr w:type="gramEnd"/>
       <w:r>
         <w:rPr>
           <w:b/>
@@ -2422,8 +2813,28 @@
           <w:sz w:val="28"/>
           <w:szCs w:val="28"/>
         </w:rPr>
+        <w:t>#</w:t>
+      </w:r>
+      <w:proofErr w:type="gramStart"/>
+      <w:r>
+        <w:rPr>
+          <w:b/>
+          <w:bCs/>
+          <w:sz w:val="28"/>
+          <w:szCs w:val="28"/>
+        </w:rPr>
+        <w:t>reportedRegionDetails</w:t>
+      </w:r>
+      <w:r>
+        <w:rPr>
+          <w:b/>
+          <w:bCs/>
+          <w:sz w:val="28"/>
+          <w:szCs w:val="28"/>
+        </w:rPr>
         <w:t>}{</w:t>
       </w:r>
+      <w:proofErr w:type="gramEnd"/>
       <w:r>
         <w:rPr>
           <w:b/>
@@ -2503,7 +2914,23 @@
           <w:sz w:val="20"/>
           <w:szCs w:val="20"/>
         </w:rPr>
-        <w:t>{disorderDescription}</w:t>
+        <w:t>{</w:t>
+      </w:r>
+      <w:proofErr w:type="spellStart"/>
+      <w:r>
+        <w:rPr>
+          <w:sz w:val="20"/>
+          <w:szCs w:val="20"/>
+        </w:rPr>
+        <w:t>disorderDescription</w:t>
+      </w:r>
+      <w:proofErr w:type="spellEnd"/>
+      <w:r>
+        <w:rPr>
+          <w:sz w:val="20"/>
+          <w:szCs w:val="20"/>
+        </w:rPr>
+        <w:t>}</w:t>
       </w:r>
     </w:p>
     <w:p>
@@ -2521,7 +2948,23 @@
           <w:sz w:val="24"/>
           <w:szCs w:val="24"/>
         </w:rPr>
-        <w:t xml:space="preserve">{#structuralVariants.length}Structural </w:t>
+        <w:t>{#</w:t>
+      </w:r>
+      <w:proofErr w:type="gramStart"/>
+      <w:r>
+        <w:rPr>
+          <w:sz w:val="24"/>
+          <w:szCs w:val="24"/>
+        </w:rPr>
+        <w:t>structuralVariants.length}Structural</w:t>
+      </w:r>
+      <w:proofErr w:type="gramEnd"/>
+      <w:r>
+        <w:rPr>
+          <w:sz w:val="24"/>
+          <w:szCs w:val="24"/>
+        </w:rPr>
+        <w:t xml:space="preserve"> </w:t>
       </w:r>
       <w:r>
         <w:rPr>
@@ -2665,6 +3108,7 @@
               </w:rPr>
               <w:t>{</w:t>
             </w:r>
+            <w:proofErr w:type="spellStart"/>
             <w:r>
               <w:rPr>
                 <w:color w:val="000000" w:themeColor="text1"/>
@@ -2673,6 +3117,7 @@
               </w:rPr>
               <w:t>svType</w:t>
             </w:r>
+            <w:proofErr w:type="spellEnd"/>
             <w:r>
               <w:rPr>
                 <w:rFonts w:cstheme="minorHAnsi"/>
@@ -2740,6 +3185,7 @@
               </w:rPr>
               <w:t>~</w:t>
             </w:r>
+            <w:proofErr w:type="spellStart"/>
             <w:r>
               <w:rPr>
                 <w:color w:val="000000" w:themeColor="text1"/>
@@ -2756,6 +3202,7 @@
               </w:rPr>
               <w:t>|formatClassification</w:t>
             </w:r>
+            <w:proofErr w:type="spellEnd"/>
             <w:r>
               <w:rPr>
                 <w:color w:val="000000" w:themeColor="text1"/>
@@ -2797,7 +3244,25 @@
           <w:szCs w:val="20"/>
           <w:lang w:val="fr-FR"/>
         </w:rPr>
-        <w:t>{~~detailsHtml}</w:t>
+        <w:t>{~~</w:t>
+      </w:r>
+      <w:proofErr w:type="spellStart"/>
+      <w:r>
+        <w:rPr>
+          <w:sz w:val="20"/>
+          <w:szCs w:val="20"/>
+          <w:lang w:val="fr-FR"/>
+        </w:rPr>
+        <w:t>detailsHtml</w:t>
+      </w:r>
+      <w:proofErr w:type="spellEnd"/>
+      <w:r>
+        <w:rPr>
+          <w:sz w:val="20"/>
+          <w:szCs w:val="20"/>
+          <w:lang w:val="fr-FR"/>
+        </w:rPr>
+        <w:t>}</w:t>
       </w:r>
     </w:p>
     <w:p>
@@ -2811,6 +3276,8 @@
           <w:lang w:val="fr-FR"/>
         </w:rPr>
       </w:pPr>
+      <w:proofErr w:type="spellStart"/>
+      <w:proofErr w:type="gramStart"/>
       <w:r>
         <w:rPr>
           <w:b/>
@@ -2819,15 +3286,45 @@
           <w:szCs w:val="20"/>
           <w:lang w:val="fr-FR"/>
         </w:rPr>
-        <w:t>Interpretation:</w:t>
-      </w:r>
-      <w:r>
-        <w:rPr>
+        <w:t>Interpretation</w:t>
+      </w:r>
+      <w:proofErr w:type="spellEnd"/>
+      <w:r>
+        <w:rPr>
+          <w:b/>
+          <w:bCs/>
           <w:sz w:val="20"/>
           <w:szCs w:val="20"/>
           <w:lang w:val="fr-FR"/>
         </w:rPr>
-        <w:t xml:space="preserve"> {interpretation}</w:t>
+        <w:t>:</w:t>
+      </w:r>
+      <w:proofErr w:type="gramEnd"/>
+      <w:r>
+        <w:rPr>
+          <w:sz w:val="20"/>
+          <w:szCs w:val="20"/>
+          <w:lang w:val="fr-FR"/>
+        </w:rPr>
+        <w:t xml:space="preserve"> {</w:t>
+      </w:r>
+      <w:proofErr w:type="spellStart"/>
+      <w:r>
+        <w:rPr>
+          <w:sz w:val="20"/>
+          <w:szCs w:val="20"/>
+          <w:lang w:val="fr-FR"/>
+        </w:rPr>
+        <w:t>interpretation</w:t>
+      </w:r>
+      <w:proofErr w:type="spellEnd"/>
+      <w:r>
+        <w:rPr>
+          <w:sz w:val="20"/>
+          <w:szCs w:val="20"/>
+          <w:lang w:val="fr-FR"/>
+        </w:rPr>
+        <w:t>}</w:t>
       </w:r>
     </w:p>
     <w:p>
@@ -2865,28 +3362,53 @@
           <w:sz w:val="24"/>
           <w:szCs w:val="24"/>
         </w:rPr>
-        <w:t>{/}</w:t>
-      </w:r>
+        <w:t>{</w:t>
+      </w:r>
+      <w:proofErr w:type="gramStart"/>
       <w:r>
         <w:rPr>
           <w:sz w:val="24"/>
           <w:szCs w:val="24"/>
         </w:rPr>
-        <w:t>{#</w:t>
+        <w:t>/}</w:t>
       </w:r>
       <w:r>
         <w:rPr>
           <w:sz w:val="24"/>
           <w:szCs w:val="24"/>
         </w:rPr>
-        <w:t>v</w:t>
-      </w:r>
+        <w:t>{</w:t>
+      </w:r>
+      <w:proofErr w:type="gramEnd"/>
       <w:r>
         <w:rPr>
           <w:sz w:val="24"/>
           <w:szCs w:val="24"/>
         </w:rPr>
-        <w:t>ariants.length}</w:t>
+        <w:t>#</w:t>
+      </w:r>
+      <w:proofErr w:type="gramStart"/>
+      <w:r>
+        <w:rPr>
+          <w:sz w:val="24"/>
+          <w:szCs w:val="24"/>
+        </w:rPr>
+        <w:t>v</w:t>
+      </w:r>
+      <w:r>
+        <w:rPr>
+          <w:sz w:val="24"/>
+          <w:szCs w:val="24"/>
+        </w:rPr>
+        <w:t>ariants.length</w:t>
+      </w:r>
+      <w:proofErr w:type="gramEnd"/>
+      <w:r>
+        <w:rPr>
+          <w:sz w:val="24"/>
+          <w:szCs w:val="24"/>
+        </w:rPr>
+        <w:t>}</w:t>
       </w:r>
       <w:r>
         <w:rPr>
@@ -3054,6 +3576,7 @@
               </w:rPr>
               <w:t>~</w:t>
             </w:r>
+            <w:proofErr w:type="spellStart"/>
             <w:r>
               <w:rPr>
                 <w:color w:val="000000" w:themeColor="text1"/>
@@ -3070,6 +3593,7 @@
               </w:rPr>
               <w:t>|formatClassification</w:t>
             </w:r>
+            <w:proofErr w:type="spellEnd"/>
             <w:r>
               <w:rPr>
                 <w:color w:val="000000" w:themeColor="text1"/>
@@ -3203,7 +3727,25 @@
                 <w:sz w:val="20"/>
                 <w:szCs w:val="20"/>
               </w:rPr>
-              <w:t>{maxPopName} Allele Frequency</w:t>
+              <w:t>{</w:t>
+            </w:r>
+            <w:proofErr w:type="spellStart"/>
+            <w:r>
+              <w:rPr>
+                <w:color w:val="595959" w:themeColor="text1" w:themeTint="A6"/>
+                <w:sz w:val="20"/>
+                <w:szCs w:val="20"/>
+              </w:rPr>
+              <w:t>maxPopName</w:t>
+            </w:r>
+            <w:proofErr w:type="spellEnd"/>
+            <w:r>
+              <w:rPr>
+                <w:color w:val="595959" w:themeColor="text1" w:themeTint="A6"/>
+                <w:sz w:val="20"/>
+                <w:szCs w:val="20"/>
+              </w:rPr>
+              <w:t>} Allele Frequency</w:t>
             </w:r>
           </w:p>
         </w:tc>
@@ -3228,14 +3770,26 @@
               </w:rPr>
               <w:t>{</w:t>
             </w:r>
-            <w:r>
-              <w:rPr>
-                <w:color w:val="000000" w:themeColor="text1"/>
-                <w:sz w:val="20"/>
-                <w:szCs w:val="20"/>
-              </w:rPr>
-              <w:t>MaxAlleleCount|formatFrequency:MaxAlleleNumber</w:t>
-            </w:r>
+            <w:proofErr w:type="spellStart"/>
+            <w:r>
+              <w:rPr>
+                <w:color w:val="000000" w:themeColor="text1"/>
+                <w:sz w:val="20"/>
+                <w:szCs w:val="20"/>
+              </w:rPr>
+              <w:t>MaxAlleleCount|</w:t>
+            </w:r>
+            <w:proofErr w:type="gramStart"/>
+            <w:r>
+              <w:rPr>
+                <w:color w:val="000000" w:themeColor="text1"/>
+                <w:sz w:val="20"/>
+                <w:szCs w:val="20"/>
+              </w:rPr>
+              <w:t>formatFrequency:MaxAlleleNumber</w:t>
+            </w:r>
+            <w:proofErr w:type="spellEnd"/>
+            <w:proofErr w:type="gramEnd"/>
             <w:r>
               <w:rPr>
                 <w:color w:val="000000" w:themeColor="text1"/>
@@ -3292,7 +3846,43 @@
                 <w:sz w:val="20"/>
                 <w:szCs w:val="20"/>
               </w:rPr>
-              <w:t>{vaf|convertToPercent} {#altReadCount}({altReadCount} of {</w:t>
+              <w:t>{</w:t>
+            </w:r>
+            <w:proofErr w:type="spellStart"/>
+            <w:r>
+              <w:rPr>
+                <w:color w:val="000000" w:themeColor="text1"/>
+                <w:sz w:val="20"/>
+                <w:szCs w:val="20"/>
+              </w:rPr>
+              <w:t>vaf|convertToPercent</w:t>
+            </w:r>
+            <w:proofErr w:type="spellEnd"/>
+            <w:r>
+              <w:rPr>
+                <w:color w:val="000000" w:themeColor="text1"/>
+                <w:sz w:val="20"/>
+                <w:szCs w:val="20"/>
+              </w:rPr>
+              <w:t>} {#</w:t>
+            </w:r>
+            <w:proofErr w:type="gramStart"/>
+            <w:r>
+              <w:rPr>
+                <w:color w:val="000000" w:themeColor="text1"/>
+                <w:sz w:val="20"/>
+                <w:szCs w:val="20"/>
+              </w:rPr>
+              <w:t>altReadCount}(</w:t>
+            </w:r>
+            <w:proofErr w:type="gramEnd"/>
+            <w:r>
+              <w:rPr>
+                <w:color w:val="000000" w:themeColor="text1"/>
+                <w:sz w:val="20"/>
+                <w:szCs w:val="20"/>
+              </w:rPr>
+              <w:t>{altReadCount} of {</w:t>
             </w:r>
             <w:r>
               <w:rPr>
@@ -3302,13 +3892,23 @@
               </w:rPr>
               <w:t>DP</w:t>
             </w:r>
-            <w:r>
-              <w:rPr>
-                <w:color w:val="000000" w:themeColor="text1"/>
-                <w:sz w:val="20"/>
-                <w:szCs w:val="20"/>
-              </w:rPr>
-              <w:t>}){/}</w:t>
+            <w:proofErr w:type="gramStart"/>
+            <w:r>
+              <w:rPr>
+                <w:color w:val="000000" w:themeColor="text1"/>
+                <w:sz w:val="20"/>
+                <w:szCs w:val="20"/>
+              </w:rPr>
+              <w:t>}){</w:t>
+            </w:r>
+            <w:proofErr w:type="gramEnd"/>
+            <w:r>
+              <w:rPr>
+                <w:color w:val="000000" w:themeColor="text1"/>
+                <w:sz w:val="20"/>
+                <w:szCs w:val="20"/>
+              </w:rPr>
+              <w:t>/}</w:t>
             </w:r>
           </w:p>
         </w:tc>
@@ -3338,6 +3938,8 @@
           <w:lang w:val="fr-FR"/>
         </w:rPr>
       </w:pPr>
+      <w:proofErr w:type="spellStart"/>
+      <w:proofErr w:type="gramStart"/>
       <w:r>
         <w:rPr>
           <w:b/>
@@ -3346,15 +3948,55 @@
           <w:szCs w:val="20"/>
           <w:lang w:val="fr-FR"/>
         </w:rPr>
-        <w:t xml:space="preserve">Criteria: </w:t>
-      </w:r>
-      <w:r>
-        <w:rPr>
+        <w:t>Criteria</w:t>
+      </w:r>
+      <w:proofErr w:type="spellEnd"/>
+      <w:r>
+        <w:rPr>
+          <w:b/>
+          <w:bCs/>
           <w:sz w:val="20"/>
           <w:szCs w:val="20"/>
           <w:lang w:val="fr-FR"/>
         </w:rPr>
-        <w:t>{ACMGClassificationCriteria|commaJoin}</w:t>
+        <w:t>:</w:t>
+      </w:r>
+      <w:proofErr w:type="gramEnd"/>
+      <w:r>
+        <w:rPr>
+          <w:b/>
+          <w:bCs/>
+          <w:sz w:val="20"/>
+          <w:szCs w:val="20"/>
+          <w:lang w:val="fr-FR"/>
+        </w:rPr>
+        <w:t xml:space="preserve"> </w:t>
+      </w:r>
+      <w:r>
+        <w:rPr>
+          <w:sz w:val="20"/>
+          <w:szCs w:val="20"/>
+          <w:lang w:val="fr-FR"/>
+        </w:rPr>
+        <w:t>{</w:t>
+      </w:r>
+      <w:proofErr w:type="spellStart"/>
+      <w:r>
+        <w:rPr>
+          <w:sz w:val="20"/>
+          <w:szCs w:val="20"/>
+          <w:lang w:val="fr-FR"/>
+        </w:rPr>
+        <w:t>ACMGClassificationCriteria|commaJoin</w:t>
+      </w:r>
+      <w:proofErr w:type="spellEnd"/>
+      <w:r>
+        <w:rPr>
+          <w:sz w:val="20"/>
+          <w:szCs w:val="20"/>
+          <w:lang w:val="fr-FR"/>
+        </w:rPr>
+        <w:t>}</w:t>
       </w:r>
     </w:p>
     <w:p>
@@ -3368,6 +4010,8 @@
           <w:lang w:val="fr-FR"/>
         </w:rPr>
       </w:pPr>
+      <w:proofErr w:type="spellStart"/>
+      <w:proofErr w:type="gramStart"/>
       <w:r>
         <w:rPr>
           <w:b/>
@@ -3376,15 +4020,45 @@
           <w:szCs w:val="20"/>
           <w:lang w:val="fr-FR"/>
         </w:rPr>
-        <w:t>Interpretation:</w:t>
-      </w:r>
-      <w:r>
-        <w:rPr>
+        <w:t>Interpretation</w:t>
+      </w:r>
+      <w:proofErr w:type="spellEnd"/>
+      <w:r>
+        <w:rPr>
+          <w:b/>
+          <w:bCs/>
           <w:sz w:val="20"/>
           <w:szCs w:val="20"/>
           <w:lang w:val="fr-FR"/>
         </w:rPr>
-        <w:t xml:space="preserve"> {interpretation}</w:t>
+        <w:t>:</w:t>
+      </w:r>
+      <w:proofErr w:type="gramEnd"/>
+      <w:r>
+        <w:rPr>
+          <w:sz w:val="20"/>
+          <w:szCs w:val="20"/>
+          <w:lang w:val="fr-FR"/>
+        </w:rPr>
+        <w:t xml:space="preserve"> {</w:t>
+      </w:r>
+      <w:proofErr w:type="spellStart"/>
+      <w:r>
+        <w:rPr>
+          <w:sz w:val="20"/>
+          <w:szCs w:val="20"/>
+          <w:lang w:val="fr-FR"/>
+        </w:rPr>
+        <w:t>interpretation</w:t>
+      </w:r>
+      <w:proofErr w:type="spellEnd"/>
+      <w:r>
+        <w:rPr>
+          <w:sz w:val="20"/>
+          <w:szCs w:val="20"/>
+          <w:lang w:val="fr-FR"/>
+        </w:rPr>
+        <w:t>}</w:t>
       </w:r>
     </w:p>
     <w:p>
@@ -3424,15 +4098,69 @@
           <w:szCs w:val="24"/>
           <w:lang w:val="fr-FR"/>
         </w:rPr>
-        <w:t>{/}{#strGenotypes.length}</w:t>
-      </w:r>
+        <w:t>{</w:t>
+      </w:r>
+      <w:proofErr w:type="gramStart"/>
       <w:r>
         <w:rPr>
           <w:sz w:val="24"/>
           <w:szCs w:val="24"/>
           <w:lang w:val="fr-FR"/>
         </w:rPr>
-        <w:t>Tandem Repeat Details</w:t>
+        <w:t>/}{</w:t>
+      </w:r>
+      <w:proofErr w:type="gramEnd"/>
+      <w:r>
+        <w:rPr>
+          <w:sz w:val="24"/>
+          <w:szCs w:val="24"/>
+          <w:lang w:val="fr-FR"/>
+        </w:rPr>
+        <w:t>#</w:t>
+      </w:r>
+      <w:proofErr w:type="gramStart"/>
+      <w:r>
+        <w:rPr>
+          <w:sz w:val="24"/>
+          <w:szCs w:val="24"/>
+          <w:lang w:val="fr-FR"/>
+        </w:rPr>
+        <w:t>strGenotypes.length}</w:t>
+      </w:r>
+      <w:r>
+        <w:rPr>
+          <w:sz w:val="24"/>
+          <w:szCs w:val="24"/>
+          <w:lang w:val="fr-FR"/>
+        </w:rPr>
+        <w:t>Tandem</w:t>
+      </w:r>
+      <w:proofErr w:type="gramEnd"/>
+      <w:r>
+        <w:rPr>
+          <w:sz w:val="24"/>
+          <w:szCs w:val="24"/>
+          <w:lang w:val="fr-FR"/>
+        </w:rPr>
+        <w:t xml:space="preserve"> </w:t>
+      </w:r>
+      <w:proofErr w:type="spellStart"/>
+      <w:r>
+        <w:rPr>
+          <w:sz w:val="24"/>
+          <w:szCs w:val="24"/>
+          <w:lang w:val="fr-FR"/>
+        </w:rPr>
+        <w:t>Repeat</w:t>
+      </w:r>
+      <w:proofErr w:type="spellEnd"/>
+      <w:r>
+        <w:rPr>
+          <w:sz w:val="24"/>
+          <w:szCs w:val="24"/>
+          <w:lang w:val="fr-FR"/>
+        </w:rPr>
+        <w:t xml:space="preserve"> Details</w:t>
       </w:r>
     </w:p>
     <w:p>
@@ -3496,7 +4224,7 @@
                 <w:sz w:val="20"/>
                 <w:szCs w:val="20"/>
               </w:rPr>
-              <w:t>Motif</w:t>
+              <w:t>Locus</w:t>
             </w:r>
           </w:p>
         </w:tc>
@@ -3519,7 +4247,25 @@
                 <w:sz w:val="20"/>
                 <w:szCs w:val="20"/>
               </w:rPr>
-              <w:t>{motif}</w:t>
+              <w:t>{</w:t>
+            </w:r>
+            <w:proofErr w:type="spellStart"/>
+            <w:r>
+              <w:rPr>
+                <w:color w:val="000000" w:themeColor="text1"/>
+                <w:sz w:val="20"/>
+                <w:szCs w:val="20"/>
+              </w:rPr>
+              <w:t>trid</w:t>
+            </w:r>
+            <w:proofErr w:type="spellEnd"/>
+            <w:r>
+              <w:rPr>
+                <w:color w:val="000000" w:themeColor="text1"/>
+                <w:sz w:val="20"/>
+                <w:szCs w:val="20"/>
+              </w:rPr>
+              <w:t>}</w:t>
             </w:r>
           </w:p>
         </w:tc>
@@ -3546,23 +4292,7 @@
                 <w:sz w:val="20"/>
                 <w:szCs w:val="20"/>
               </w:rPr>
-              <w:t>G</w:t>
-            </w:r>
-            <w:r>
-              <w:rPr>
-                <w:color w:val="595959" w:themeColor="text1" w:themeTint="A6"/>
-                <w:sz w:val="20"/>
-                <w:szCs w:val="20"/>
-              </w:rPr>
-              <w:t>ene &amp; Transcr</w:t>
-            </w:r>
-            <w:r>
-              <w:rPr>
-                <w:color w:val="595959" w:themeColor="text1" w:themeTint="A6"/>
-                <w:sz w:val="20"/>
-                <w:szCs w:val="20"/>
-              </w:rPr>
-              <w:t>ipt</w:t>
+              <w:t>Motif</w:t>
             </w:r>
           </w:p>
         </w:tc>
@@ -3585,75 +4315,7 @@
                 <w:sz w:val="20"/>
                 <w:szCs w:val="20"/>
               </w:rPr>
-              <w:t>{</w:t>
-            </w:r>
-            <w:r>
-              <w:rPr>
-                <w:color w:val="000000" w:themeColor="text1"/>
-                <w:sz w:val="20"/>
-                <w:szCs w:val="20"/>
-              </w:rPr>
-              <w:t>g</w:t>
-            </w:r>
-            <w:r>
-              <w:rPr>
-                <w:color w:val="000000" w:themeColor="text1"/>
-                <w:sz w:val="20"/>
-                <w:szCs w:val="20"/>
-              </w:rPr>
-              <w:t>ene</w:t>
-            </w:r>
-            <w:r>
-              <w:rPr>
-                <w:color w:val="000000" w:themeColor="text1"/>
-                <w:sz w:val="20"/>
-                <w:szCs w:val="20"/>
-              </w:rPr>
-              <w:t>}</w:t>
-            </w:r>
-            <w:r>
-              <w:rPr>
-                <w:color w:val="000000" w:themeColor="text1"/>
-                <w:sz w:val="20"/>
-                <w:szCs w:val="20"/>
-              </w:rPr>
-              <w:t xml:space="preserve"> </w:t>
-            </w:r>
-            <w:r>
-              <w:rPr>
-                <w:rFonts w:cstheme="minorHAnsi"/>
-                <w:color w:val="242729"/>
-                <w:sz w:val="20"/>
-                <w:szCs w:val="20"/>
-              </w:rPr>
-              <w:t>{</w:t>
-            </w:r>
-            <w:r>
-              <w:rPr>
-                <w:rFonts w:cstheme="minorHAnsi"/>
-                <w:color w:val="242729"/>
-                <w:sz w:val="20"/>
-                <w:szCs w:val="20"/>
-              </w:rPr>
-              <w:t>t</w:t>
-            </w:r>
-            <w:r>
-              <w:rPr>
-                <w:rFonts w:cstheme="minorHAnsi"/>
-                <w:color w:val="242729"/>
-                <w:sz w:val="20"/>
-                <w:szCs w:val="20"/>
-              </w:rPr>
-              <w:t>ranscript</w:t>
-            </w:r>
-            <w:r>
-              <w:rPr>
-                <w:rFonts w:cstheme="minorHAnsi"/>
-                <w:color w:val="242729"/>
-                <w:sz w:val="20"/>
-                <w:szCs w:val="20"/>
-              </w:rPr>
-              <w:t>}</w:t>
+              <w:t>{motif}</w:t>
             </w:r>
           </w:p>
         </w:tc>
@@ -3680,7 +4342,23 @@
                 <w:sz w:val="20"/>
                 <w:szCs w:val="20"/>
               </w:rPr>
-              <w:t>Classification</w:t>
+              <w:t>Genomic</w:t>
+            </w:r>
+            <w:r>
+              <w:rPr>
+                <w:color w:val="595959" w:themeColor="text1" w:themeTint="A6"/>
+                <w:sz w:val="20"/>
+                <w:szCs w:val="20"/>
+              </w:rPr>
+              <w:t xml:space="preserve"> </w:t>
+            </w:r>
+            <w:r>
+              <w:rPr>
+                <w:color w:val="595959" w:themeColor="text1" w:themeTint="A6"/>
+                <w:sz w:val="20"/>
+                <w:szCs w:val="20"/>
+              </w:rPr>
+              <w:t>Position</w:t>
             </w:r>
           </w:p>
         </w:tc>
@@ -3703,7 +4381,25 @@
                 <w:sz w:val="20"/>
                 <w:szCs w:val="20"/>
               </w:rPr>
-              <w:t>{~classificationHtml}</w:t>
+              <w:t>{</w:t>
+            </w:r>
+            <w:proofErr w:type="spellStart"/>
+            <w:r>
+              <w:rPr>
+                <w:color w:val="000000" w:themeColor="text1"/>
+                <w:sz w:val="20"/>
+                <w:szCs w:val="20"/>
+              </w:rPr>
+              <w:t>genomicPosition</w:t>
+            </w:r>
+            <w:proofErr w:type="spellEnd"/>
+            <w:r>
+              <w:rPr>
+                <w:color w:val="000000" w:themeColor="text1"/>
+                <w:sz w:val="20"/>
+                <w:szCs w:val="20"/>
+              </w:rPr>
+              <w:t>}</w:t>
             </w:r>
           </w:p>
         </w:tc>
@@ -3730,7 +4426,23 @@
                 <w:sz w:val="20"/>
                 <w:szCs w:val="20"/>
               </w:rPr>
-              <w:t>Location</w:t>
+              <w:t>G</w:t>
+            </w:r>
+            <w:r>
+              <w:rPr>
+                <w:color w:val="595959" w:themeColor="text1" w:themeTint="A6"/>
+                <w:sz w:val="20"/>
+                <w:szCs w:val="20"/>
+              </w:rPr>
+              <w:t>ene &amp; Transcr</w:t>
+            </w:r>
+            <w:r>
+              <w:rPr>
+                <w:color w:val="595959" w:themeColor="text1" w:themeTint="A6"/>
+                <w:sz w:val="20"/>
+                <w:szCs w:val="20"/>
+              </w:rPr>
+              <w:t>ipt</w:t>
             </w:r>
           </w:p>
         </w:tc>
@@ -3742,7 +4454,7 @@
             <w:pPr>
               <w:widowControl w:val="0"/>
               <w:rPr>
-                <w:color w:val="7F7F7F" w:themeColor="text1" w:themeTint="80"/>
+                <w:color w:val="000000" w:themeColor="text1"/>
                 <w:sz w:val="20"/>
                 <w:szCs w:val="20"/>
               </w:rPr>
@@ -3761,19 +4473,63 @@
                 <w:sz w:val="20"/>
                 <w:szCs w:val="20"/>
               </w:rPr>
-              <w:t>l</w:t>
-            </w:r>
-            <w:r>
-              <w:rPr>
-                <w:color w:val="000000" w:themeColor="text1"/>
-                <w:sz w:val="20"/>
-                <w:szCs w:val="20"/>
-              </w:rPr>
-              <w:t>ocation</w:t>
-            </w:r>
-            <w:r>
-              <w:rPr>
-                <w:color w:val="000000" w:themeColor="text1"/>
+              <w:t>g</w:t>
+            </w:r>
+            <w:r>
+              <w:rPr>
+                <w:color w:val="000000" w:themeColor="text1"/>
+                <w:sz w:val="20"/>
+                <w:szCs w:val="20"/>
+              </w:rPr>
+              <w:t>ene</w:t>
+            </w:r>
+            <w:r>
+              <w:rPr>
+                <w:color w:val="000000" w:themeColor="text1"/>
+                <w:sz w:val="20"/>
+                <w:szCs w:val="20"/>
+              </w:rPr>
+              <w:t>}</w:t>
+            </w:r>
+            <w:r>
+              <w:rPr>
+                <w:color w:val="000000" w:themeColor="text1"/>
+                <w:sz w:val="20"/>
+                <w:szCs w:val="20"/>
+              </w:rPr>
+              <w:t xml:space="preserve"> </w:t>
+            </w:r>
+            <w:r>
+              <w:rPr>
+                <w:rFonts w:cstheme="minorHAnsi"/>
+                <w:color w:val="242729"/>
+                <w:sz w:val="20"/>
+                <w:szCs w:val="20"/>
+              </w:rPr>
+              <w:t>{</w:t>
+            </w:r>
+            <w:r>
+              <w:rPr>
+                <w:rFonts w:cstheme="minorHAnsi"/>
+                <w:color w:val="242729"/>
+                <w:sz w:val="20"/>
+                <w:szCs w:val="20"/>
+              </w:rPr>
+              <w:t>t</w:t>
+            </w:r>
+            <w:r>
+              <w:rPr>
+                <w:rFonts w:cstheme="minorHAnsi"/>
+                <w:color w:val="242729"/>
+                <w:sz w:val="20"/>
+                <w:szCs w:val="20"/>
+              </w:rPr>
+              <w:t>ranscript</w:t>
+            </w:r>
+            <w:r>
+              <w:rPr>
+                <w:rFonts w:cstheme="minorHAnsi"/>
+                <w:color w:val="242729"/>
                 <w:sz w:val="20"/>
                 <w:szCs w:val="20"/>
               </w:rPr>
@@ -3804,6 +4560,148 @@
                 <w:sz w:val="20"/>
                 <w:szCs w:val="20"/>
               </w:rPr>
+              <w:t>Classification</w:t>
+            </w:r>
+          </w:p>
+        </w:tc>
+        <w:tc>
+          <w:tcPr>
+            <w:tcW w:w="4131" w:type="dxa"/>
+          </w:tcPr>
+          <w:p>
+            <w:pPr>
+              <w:widowControl w:val="0"/>
+              <w:rPr>
+                <w:color w:val="000000" w:themeColor="text1"/>
+                <w:sz w:val="20"/>
+                <w:szCs w:val="20"/>
+              </w:rPr>
+            </w:pPr>
+            <w:r>
+              <w:rPr>
+                <w:color w:val="000000" w:themeColor="text1"/>
+                <w:sz w:val="20"/>
+                <w:szCs w:val="20"/>
+              </w:rPr>
+              <w:t>{~</w:t>
+            </w:r>
+            <w:proofErr w:type="spellStart"/>
+            <w:r>
+              <w:rPr>
+                <w:color w:val="000000" w:themeColor="text1"/>
+                <w:sz w:val="20"/>
+                <w:szCs w:val="20"/>
+              </w:rPr>
+              <w:t>classificationHtml</w:t>
+            </w:r>
+            <w:proofErr w:type="spellEnd"/>
+            <w:r>
+              <w:rPr>
+                <w:color w:val="000000" w:themeColor="text1"/>
+                <w:sz w:val="20"/>
+                <w:szCs w:val="20"/>
+              </w:rPr>
+              <w:t>}</w:t>
+            </w:r>
+          </w:p>
+        </w:tc>
+      </w:tr>
+      <w:tr>
+        <w:tc>
+          <w:tcPr>
+            <w:tcW w:w="3581" w:type="dxa"/>
+          </w:tcPr>
+          <w:p>
+            <w:pPr>
+              <w:widowControl w:val="0"/>
+              <w:ind w:left="-34"/>
+              <w:jc w:val="right"/>
+              <w:rPr>
+                <w:color w:val="595959" w:themeColor="text1" w:themeTint="A6"/>
+                <w:sz w:val="20"/>
+                <w:szCs w:val="20"/>
+              </w:rPr>
+            </w:pPr>
+            <w:r>
+              <w:rPr>
+                <w:color w:val="595959" w:themeColor="text1" w:themeTint="A6"/>
+                <w:sz w:val="20"/>
+                <w:szCs w:val="20"/>
+              </w:rPr>
+              <w:t>Location</w:t>
+            </w:r>
+          </w:p>
+        </w:tc>
+        <w:tc>
+          <w:tcPr>
+            <w:tcW w:w="4131" w:type="dxa"/>
+          </w:tcPr>
+          <w:p>
+            <w:pPr>
+              <w:widowControl w:val="0"/>
+              <w:rPr>
+                <w:color w:val="7F7F7F" w:themeColor="text1" w:themeTint="80"/>
+                <w:sz w:val="20"/>
+                <w:szCs w:val="20"/>
+              </w:rPr>
+            </w:pPr>
+            <w:r>
+              <w:rPr>
+                <w:color w:val="000000" w:themeColor="text1"/>
+                <w:sz w:val="20"/>
+                <w:szCs w:val="20"/>
+              </w:rPr>
+              <w:t>{</w:t>
+            </w:r>
+            <w:r>
+              <w:rPr>
+                <w:color w:val="000000" w:themeColor="text1"/>
+                <w:sz w:val="20"/>
+                <w:szCs w:val="20"/>
+              </w:rPr>
+              <w:t>l</w:t>
+            </w:r>
+            <w:r>
+              <w:rPr>
+                <w:color w:val="000000" w:themeColor="text1"/>
+                <w:sz w:val="20"/>
+                <w:szCs w:val="20"/>
+              </w:rPr>
+              <w:t>ocation</w:t>
+            </w:r>
+            <w:r>
+              <w:rPr>
+                <w:color w:val="000000" w:themeColor="text1"/>
+                <w:sz w:val="20"/>
+                <w:szCs w:val="20"/>
+              </w:rPr>
+              <w:t>}</w:t>
+            </w:r>
+          </w:p>
+        </w:tc>
+      </w:tr>
+      <w:tr>
+        <w:tc>
+          <w:tcPr>
+            <w:tcW w:w="3581" w:type="dxa"/>
+          </w:tcPr>
+          <w:p>
+            <w:pPr>
+              <w:widowControl w:val="0"/>
+              <w:ind w:left="-34"/>
+              <w:jc w:val="right"/>
+              <w:rPr>
+                <w:color w:val="595959" w:themeColor="text1" w:themeTint="A6"/>
+                <w:sz w:val="20"/>
+                <w:szCs w:val="20"/>
+              </w:rPr>
+            </w:pPr>
+            <w:r>
+              <w:rPr>
+                <w:color w:val="595959" w:themeColor="text1" w:themeTint="A6"/>
+                <w:sz w:val="20"/>
+                <w:szCs w:val="20"/>
+              </w:rPr>
               <w:t>Read Depth</w:t>
             </w:r>
           </w:p>
@@ -3829,6 +4727,7 @@
               </w:rPr>
               <w:t>{</w:t>
             </w:r>
+            <w:proofErr w:type="spellStart"/>
             <w:r>
               <w:rPr>
                 <w:color w:val="000000" w:themeColor="text1"/>
@@ -3845,6 +4744,7 @@
               </w:rPr>
               <w:t>eadDepth</w:t>
             </w:r>
+            <w:proofErr w:type="spellEnd"/>
             <w:r>
               <w:rPr>
                 <w:color w:val="000000" w:themeColor="text1"/>
@@ -4033,8 +4933,9 @@
           <w:szCs w:val="20"/>
         </w:rPr>
         <w:lastRenderedPageBreak/>
-        <w:t>Mode of Inheritance</w:t>
-      </w:r>
+        <w:t xml:space="preserve">Mode of </w:t>
+      </w:r>
+      <w:proofErr w:type="gramStart"/>
       <w:r>
         <w:rPr>
           <w:b/>
@@ -4043,6 +4944,16 @@
           <w:sz w:val="20"/>
           <w:szCs w:val="20"/>
         </w:rPr>
+        <w:t>Inheritance</w:t>
+      </w:r>
+      <w:r>
+        <w:rPr>
+          <w:b/>
+          <w:bCs/>
+          <w:color w:val="000000" w:themeColor="text1"/>
+          <w:sz w:val="20"/>
+          <w:szCs w:val="20"/>
+        </w:rPr>
         <w:t xml:space="preserve">: </w:t>
       </w:r>
       <w:r>
@@ -4052,7 +4963,17 @@
           <w:sz w:val="20"/>
           <w:szCs w:val="20"/>
         </w:rPr>
-        <w:t>{~</w:t>
+        <w:t>{</w:t>
+      </w:r>
+      <w:proofErr w:type="gramEnd"/>
+      <w:r>
+        <w:rPr>
+          <w:rFonts w:cstheme="minorHAnsi"/>
+          <w:color w:val="242729"/>
+          <w:sz w:val="20"/>
+          <w:szCs w:val="20"/>
+        </w:rPr>
+        <w:t>~</w:t>
       </w:r>
       <w:r>
         <w:rPr>
@@ -4092,6 +5013,7 @@
           <w:szCs w:val="20"/>
         </w:rPr>
       </w:pPr>
+      <w:proofErr w:type="gramStart"/>
       <w:r>
         <w:rPr>
           <w:b/>
@@ -4117,6 +5039,7 @@
         </w:rPr>
         <w:t xml:space="preserve"> {</w:t>
       </w:r>
+      <w:proofErr w:type="gramEnd"/>
       <w:r>
         <w:rPr>
           <w:sz w:val="20"/>
@@ -4149,6 +5072,7 @@
           <w:szCs w:val="20"/>
         </w:rPr>
       </w:pPr>
+      <w:proofErr w:type="gramStart"/>
       <w:r>
         <w:rPr>
           <w:b/>
@@ -4174,6 +5098,7 @@
         </w:rPr>
         <w:t xml:space="preserve"> {</w:t>
       </w:r>
+      <w:proofErr w:type="gramEnd"/>
       <w:r>
         <w:rPr>
           <w:sz w:val="20"/>
@@ -4231,8 +5156,9 @@
           <w:sz w:val="20"/>
           <w:szCs w:val="20"/>
         </w:rPr>
-        <w:t xml:space="preserve"> Onset</w:t>
-      </w:r>
+        <w:t xml:space="preserve"> </w:t>
+      </w:r>
+      <w:proofErr w:type="gramStart"/>
       <w:r>
         <w:rPr>
           <w:b/>
@@ -4240,6 +5166,15 @@
           <w:sz w:val="20"/>
           <w:szCs w:val="20"/>
         </w:rPr>
+        <w:t>Onset</w:t>
+      </w:r>
+      <w:r>
+        <w:rPr>
+          <w:b/>
+          <w:bCs/>
+          <w:sz w:val="20"/>
+          <w:szCs w:val="20"/>
+        </w:rPr>
         <w:t>:</w:t>
       </w:r>
       <w:r>
@@ -4249,6 +5184,8 @@
         </w:rPr>
         <w:t xml:space="preserve"> {</w:t>
       </w:r>
+      <w:proofErr w:type="spellStart"/>
+      <w:proofErr w:type="gramEnd"/>
       <w:r>
         <w:rPr>
           <w:sz w:val="20"/>
@@ -4277,6 +5214,7 @@
         </w:rPr>
         <w:t>Onset</w:t>
       </w:r>
+      <w:proofErr w:type="spellEnd"/>
       <w:r>
         <w:rPr>
           <w:sz w:val="20"/>
@@ -4295,6 +5233,7 @@
           <w:szCs w:val="26"/>
         </w:rPr>
       </w:pPr>
+      <w:proofErr w:type="gramStart"/>
       <w:r>
         <w:rPr>
           <w:sz w:val="26"/>
@@ -4330,6 +5269,7 @@
         </w:rPr>
         <w:t>}</w:t>
       </w:r>
+      <w:proofErr w:type="gramEnd"/>
     </w:p>
     <w:p>
       <w:pPr>
@@ -4373,7 +5313,25 @@
           <w:sz w:val="20"/>
           <w:szCs w:val="20"/>
         </w:rPr>
-        <w:t>Pathogenicity classifications for short tandem repeats are based on gene-specific motif count thresholds obtained from the STRchive database, a curated resource of STRs associated with human disease. The ranges below define Benign, Intermediate, and Pathogenic classifications for the reported genes.</w:t>
+        <w:t xml:space="preserve">Pathogenicity classifications for short tandem repeats are based on gene-specific motif count thresholds obtained from the </w:t>
+      </w:r>
+      <w:proofErr w:type="spellStart"/>
+      <w:r>
+        <w:rPr>
+          <w:rFonts w:cstheme="minorHAnsi"/>
+          <w:sz w:val="20"/>
+          <w:szCs w:val="20"/>
+        </w:rPr>
+        <w:t>STRchive</w:t>
+      </w:r>
+      <w:proofErr w:type="spellEnd"/>
+      <w:r>
+        <w:rPr>
+          <w:rFonts w:cstheme="minorHAnsi"/>
+          <w:sz w:val="20"/>
+          <w:szCs w:val="20"/>
+        </w:rPr>
+        <w:t xml:space="preserve"> database, a curated resource of STRs associated with human disease. The ranges below define Benign, Intermediate, and Pathogenic classifications for the reported genes.</w:t>
       </w:r>
     </w:p>
     <w:tbl>
@@ -4611,6 +5569,7 @@
               </w:rPr>
               <w:t>{#</w:t>
             </w:r>
+            <w:proofErr w:type="gramStart"/>
             <w:r>
               <w:rPr>
                 <w:rFonts w:cstheme="minorHAnsi"/>
@@ -4627,6 +5586,7 @@
               </w:rPr>
               <w:t>}{</w:t>
             </w:r>
+            <w:proofErr w:type="gramEnd"/>
             <w:r>
               <w:rPr>
                 <w:rFonts w:cstheme="minorHAnsi"/>
@@ -4761,6 +5721,7 @@
               </w:rPr>
               <w:t>{</w:t>
             </w:r>
+            <w:proofErr w:type="spellStart"/>
             <w:r>
               <w:rPr>
                 <w:rFonts w:cstheme="minorHAnsi"/>
@@ -4777,6 +5738,7 @@
               </w:rPr>
               <w:t>enignRange</w:t>
             </w:r>
+            <w:proofErr w:type="spellEnd"/>
             <w:r>
               <w:rPr>
                 <w:rFonts w:cstheme="minorHAnsi"/>
@@ -4811,6 +5773,7 @@
               </w:rPr>
               <w:t>{</w:t>
             </w:r>
+            <w:proofErr w:type="spellStart"/>
             <w:r>
               <w:rPr>
                 <w:rFonts w:cstheme="minorHAnsi"/>
@@ -4827,6 +5790,7 @@
               </w:rPr>
               <w:t>ntermediateRange</w:t>
             </w:r>
+            <w:proofErr w:type="spellEnd"/>
             <w:r>
               <w:rPr>
                 <w:rFonts w:cstheme="minorHAnsi"/>
@@ -4861,6 +5825,7 @@
               </w:rPr>
               <w:t>{</w:t>
             </w:r>
+            <w:proofErr w:type="spellStart"/>
             <w:r>
               <w:rPr>
                 <w:rFonts w:cstheme="minorHAnsi"/>
@@ -4877,13 +5842,24 @@
               </w:rPr>
               <w:t>athogenicRange</w:t>
             </w:r>
-            <w:r>
-              <w:rPr>
-                <w:rFonts w:cstheme="minorHAnsi"/>
-                <w:sz w:val="20"/>
-                <w:szCs w:val="20"/>
-              </w:rPr>
-              <w:t>}{/}</w:t>
+            <w:proofErr w:type="spellEnd"/>
+            <w:proofErr w:type="gramStart"/>
+            <w:r>
+              <w:rPr>
+                <w:rFonts w:cstheme="minorHAnsi"/>
+                <w:sz w:val="20"/>
+                <w:szCs w:val="20"/>
+              </w:rPr>
+              <w:t>}{</w:t>
+            </w:r>
+            <w:proofErr w:type="gramEnd"/>
+            <w:r>
+              <w:rPr>
+                <w:rFonts w:cstheme="minorHAnsi"/>
+                <w:sz w:val="20"/>
+                <w:szCs w:val="20"/>
+              </w:rPr>
+              <w:t>/}</w:t>
             </w:r>
           </w:p>
         </w:tc>
@@ -5152,6 +6128,7 @@
               </w:rPr>
               <w:t>{#</w:t>
             </w:r>
+            <w:proofErr w:type="gramStart"/>
             <w:r>
               <w:rPr>
                 <w:rFonts w:cstheme="minorHAnsi"/>
@@ -5168,6 +6145,7 @@
               </w:rPr>
               <w:t>trGenotypes}{</w:t>
             </w:r>
+            <w:proofErr w:type="gramEnd"/>
             <w:r>
               <w:rPr>
                 <w:rFonts w:cstheme="minorHAnsi"/>
@@ -5294,6 +6272,7 @@
               </w:rPr>
               <w:t>{</w:t>
             </w:r>
+            <w:proofErr w:type="spellStart"/>
             <w:r>
               <w:rPr>
                 <w:rFonts w:cstheme="minorHAnsi"/>
@@ -5308,7 +6287,16 @@
                 <w:sz w:val="20"/>
                 <w:szCs w:val="20"/>
               </w:rPr>
-              <w:t>eadDepth}</w:t>
+              <w:t>eadDepth</w:t>
+            </w:r>
+            <w:proofErr w:type="spellEnd"/>
+            <w:r>
+              <w:rPr>
+                <w:rFonts w:cstheme="minorHAnsi"/>
+                <w:sz w:val="20"/>
+                <w:szCs w:val="20"/>
+              </w:rPr>
+              <w:t>}</w:t>
             </w:r>
           </w:p>
         </w:tc>
@@ -5376,7 +6364,25 @@
                 <w:sz w:val="20"/>
                 <w:szCs w:val="20"/>
               </w:rPr>
-              <w:t>{~motifCount2}{/}</w:t>
+              <w:t>{~motifCount</w:t>
+            </w:r>
+            <w:proofErr w:type="gramStart"/>
+            <w:r>
+              <w:rPr>
+                <w:rFonts w:cstheme="minorHAnsi"/>
+                <w:sz w:val="20"/>
+                <w:szCs w:val="20"/>
+              </w:rPr>
+              <w:t>2}{</w:t>
+            </w:r>
+            <w:proofErr w:type="gramEnd"/>
+            <w:r>
+              <w:rPr>
+                <w:rFonts w:cstheme="minorHAnsi"/>
+                <w:sz w:val="20"/>
+                <w:szCs w:val="20"/>
+              </w:rPr>
+              <w:t>/}</w:t>
             </w:r>
           </w:p>
         </w:tc>
@@ -5426,15 +6432,16 @@
           <w:szCs w:val="28"/>
         </w:rPr>
         <w:lastRenderedPageBreak/>
-        <w:t>{#s</w:t>
-      </w:r>
+        <w:t>{#</w:t>
+      </w:r>
+      <w:proofErr w:type="gramStart"/>
       <w:r>
         <w:rPr>
           <w:color w:val="4472C4" w:themeColor="accent1"/>
           <w:sz w:val="28"/>
           <w:szCs w:val="28"/>
         </w:rPr>
-        <w:t>upportingImages</w:t>
+        <w:t>s</w:t>
       </w:r>
       <w:r>
         <w:rPr>
@@ -5442,7 +6449,24 @@
           <w:sz w:val="28"/>
           <w:szCs w:val="28"/>
         </w:rPr>
-        <w:t>.length}Supporting Visualizations</w:t>
+        <w:t>upportingImages</w:t>
+      </w:r>
+      <w:r>
+        <w:rPr>
+          <w:color w:val="4472C4" w:themeColor="accent1"/>
+          <w:sz w:val="28"/>
+          <w:szCs w:val="28"/>
+        </w:rPr>
+        <w:t>.length}Supporting</w:t>
+      </w:r>
+      <w:proofErr w:type="gramEnd"/>
+      <w:r>
+        <w:rPr>
+          <w:color w:val="4472C4" w:themeColor="accent1"/>
+          <w:sz w:val="28"/>
+          <w:szCs w:val="28"/>
+        </w:rPr>
+        <w:t xml:space="preserve"> Visualizations</w:t>
       </w:r>
     </w:p>
     <w:p>
@@ -5589,7 +6613,30 @@
           <w:sz w:val="26"/>
           <w:szCs w:val="26"/>
         </w:rPr>
-        <w:t>{/}{/}</w:t>
+        <w:t>{</w:t>
+      </w:r>
+      <w:proofErr w:type="gramStart"/>
+      <w:r>
+        <w:rPr>
+          <w:sz w:val="26"/>
+          <w:szCs w:val="26"/>
+        </w:rPr>
+        <w:t>/}{/}</w:t>
+      </w:r>
+      <w:r>
+        <w:rPr>
+          <w:sz w:val="26"/>
+          <w:szCs w:val="26"/>
+        </w:rPr>
+        <w:t>{</w:t>
+      </w:r>
+      <w:proofErr w:type="gramEnd"/>
+      <w:r>
+        <w:rPr>
+          <w:sz w:val="26"/>
+          <w:szCs w:val="26"/>
+        </w:rPr>
+        <w:t>#coverageStats.length&gt;0}</w:t>
       </w:r>
     </w:p>
     <w:p>
@@ -5598,31 +6645,1016 @@
           <w:bottom w:val="single" w:sz="4" w:space="1" w:color="auto"/>
         </w:pBdr>
         <w:rPr>
-          <w:rFonts w:cstheme="minorHAnsi"/>
-          <w:sz w:val="20"/>
-          <w:szCs w:val="20"/>
+          <w:color w:val="4472C4" w:themeColor="accent1"/>
+          <w:sz w:val="28"/>
+          <w:szCs w:val="28"/>
         </w:rPr>
       </w:pPr>
       <w:r>
         <w:rPr>
-          <w:sz w:val="26"/>
-          <w:szCs w:val="26"/>
+          <w:color w:val="4472C4" w:themeColor="accent1"/>
+          <w:sz w:val="28"/>
+          <w:szCs w:val="28"/>
+        </w:rPr>
+        <w:t xml:space="preserve">Target Region </w:t>
+      </w:r>
+      <w:r>
+        <w:rPr>
+          <w:color w:val="4472C4" w:themeColor="accent1"/>
+          <w:sz w:val="28"/>
+          <w:szCs w:val="28"/>
+        </w:rPr>
+        <w:t>Coverage</w:t>
+      </w:r>
+    </w:p>
+    <w:p>
+      <w:r>
+        <w:t>Coverage statistics were computed over {</w:t>
+      </w:r>
+      <w:proofErr w:type="spellStart"/>
+      <w:r>
+        <w:t>coverageStats.length</w:t>
+      </w:r>
+      <w:proofErr w:type="spellEnd"/>
+      <w:r>
+        <w:t>} targets.</w:t>
+      </w:r>
+    </w:p>
+    <w:tbl>
+      <w:tblPr>
+        <w:tblStyle w:val="ListTable7Colorful-Accent1"/>
+        <w:tblpPr w:leftFromText="180" w:rightFromText="180" w:vertAnchor="text" w:horzAnchor="margin" w:tblpY="29"/>
+        <w:tblW w:w="10800" w:type="dxa"/>
+        <w:tblLayout w:type="fixed"/>
+        <w:tblLook w:val="04A0" w:firstRow="1" w:lastRow="0" w:firstColumn="1" w:lastColumn="0" w:noHBand="0" w:noVBand="1"/>
+      </w:tblPr>
+      <w:tblGrid>
+        <w:gridCol w:w="2520"/>
+        <w:gridCol w:w="2070"/>
+        <w:gridCol w:w="1260"/>
+        <w:gridCol w:w="1170"/>
+        <w:gridCol w:w="1260"/>
+        <w:gridCol w:w="1260"/>
+        <w:gridCol w:w="1260"/>
+      </w:tblGrid>
+      <w:tr>
+        <w:trPr>
+          <w:cnfStyle w:val="100000000000" w:firstRow="1" w:lastRow="0" w:firstColumn="0" w:lastColumn="0" w:oddVBand="0" w:evenVBand="0" w:oddHBand="0" w:evenHBand="0" w:firstRowFirstColumn="0" w:firstRowLastColumn="0" w:lastRowFirstColumn="0" w:lastRowLastColumn="0"/>
+          <w:trHeight w:val="179"/>
+        </w:trPr>
+        <w:tc>
+          <w:tcPr>
+            <w:cnfStyle w:val="001000000100" w:firstRow="0" w:lastRow="0" w:firstColumn="1" w:lastColumn="0" w:oddVBand="0" w:evenVBand="0" w:oddHBand="0" w:evenHBand="0" w:firstRowFirstColumn="1" w:firstRowLastColumn="0" w:lastRowFirstColumn="0" w:lastRowLastColumn="0"/>
+            <w:tcW w:w="2520" w:type="dxa"/>
+            <w:vMerge w:val="restart"/>
+            <w:vAlign w:val="bottom"/>
+          </w:tcPr>
+          <w:p>
+            <w:pPr>
+              <w:jc w:val="center"/>
+              <w:rPr>
+                <w:rFonts w:cstheme="minorHAnsi"/>
+                <w:b/>
+                <w:bCs/>
+                <w:iCs w:val="0"/>
+                <w:color w:val="0D0D0D" w:themeColor="text1" w:themeTint="F2"/>
+                <w:sz w:val="20"/>
+                <w:szCs w:val="20"/>
+              </w:rPr>
+            </w:pPr>
+            <w:r>
+              <w:rPr>
+                <w:rFonts w:asciiTheme="minorHAnsi" w:hAnsiTheme="minorHAnsi" w:cstheme="minorHAnsi"/>
+                <w:b/>
+                <w:bCs/>
+                <w:i w:val="0"/>
+                <w:color w:val="0D0D0D" w:themeColor="text1" w:themeTint="F2"/>
+                <w:sz w:val="20"/>
+                <w:szCs w:val="20"/>
+              </w:rPr>
+              <w:t>Region</w:t>
+            </w:r>
+          </w:p>
+        </w:tc>
+        <w:tc>
+          <w:tcPr>
+            <w:tcW w:w="2070" w:type="dxa"/>
+            <w:vMerge w:val="restart"/>
+            <w:vAlign w:val="bottom"/>
+          </w:tcPr>
+          <w:p>
+            <w:pPr>
+              <w:jc w:val="center"/>
+              <w:cnfStyle w:val="100000000000" w:firstRow="1" w:lastRow="0" w:firstColumn="0" w:lastColumn="0" w:oddVBand="0" w:evenVBand="0" w:oddHBand="0" w:evenHBand="0" w:firstRowFirstColumn="0" w:firstRowLastColumn="0" w:lastRowFirstColumn="0" w:lastRowLastColumn="0"/>
+              <w:rPr>
+                <w:rFonts w:cstheme="minorHAnsi"/>
+                <w:b/>
+                <w:bCs/>
+                <w:iCs w:val="0"/>
+                <w:color w:val="0D0D0D" w:themeColor="text1" w:themeTint="F2"/>
+                <w:sz w:val="20"/>
+                <w:szCs w:val="20"/>
+              </w:rPr>
+            </w:pPr>
+            <w:r>
+              <w:rPr>
+                <w:rFonts w:asciiTheme="minorHAnsi" w:hAnsiTheme="minorHAnsi" w:cstheme="minorHAnsi"/>
+                <w:b/>
+                <w:bCs/>
+                <w:i w:val="0"/>
+                <w:color w:val="0D0D0D" w:themeColor="text1" w:themeTint="F2"/>
+                <w:sz w:val="20"/>
+                <w:szCs w:val="20"/>
+              </w:rPr>
+              <w:t>Name</w:t>
+            </w:r>
+          </w:p>
+        </w:tc>
+        <w:tc>
+          <w:tcPr>
+            <w:tcW w:w="1260" w:type="dxa"/>
+            <w:vMerge w:val="restart"/>
+            <w:vAlign w:val="bottom"/>
+          </w:tcPr>
+          <w:p>
+            <w:pPr>
+              <w:jc w:val="center"/>
+              <w:cnfStyle w:val="100000000000" w:firstRow="1" w:lastRow="0" w:firstColumn="0" w:lastColumn="0" w:oddVBand="0" w:evenVBand="0" w:oddHBand="0" w:evenHBand="0" w:firstRowFirstColumn="0" w:firstRowLastColumn="0" w:lastRowFirstColumn="0" w:lastRowLastColumn="0"/>
+              <w:rPr>
+                <w:rFonts w:asciiTheme="minorHAnsi" w:hAnsiTheme="minorHAnsi" w:cstheme="minorHAnsi"/>
+                <w:b/>
+                <w:bCs/>
+                <w:i w:val="0"/>
+                <w:color w:val="0D0D0D" w:themeColor="text1" w:themeTint="F2"/>
+                <w:sz w:val="20"/>
+                <w:szCs w:val="20"/>
+              </w:rPr>
+            </w:pPr>
+            <w:r>
+              <w:rPr>
+                <w:rFonts w:asciiTheme="minorHAnsi" w:hAnsiTheme="minorHAnsi" w:cstheme="minorHAnsi"/>
+                <w:b/>
+                <w:bCs/>
+                <w:i w:val="0"/>
+                <w:color w:val="0D0D0D" w:themeColor="text1" w:themeTint="F2"/>
+                <w:sz w:val="20"/>
+                <w:szCs w:val="20"/>
+              </w:rPr>
+              <w:t>Mean Depth</w:t>
+            </w:r>
+          </w:p>
+        </w:tc>
+        <w:tc>
+          <w:tcPr>
+            <w:tcW w:w="4950" w:type="dxa"/>
+            <w:gridSpan w:val="4"/>
+            <w:vAlign w:val="bottom"/>
+          </w:tcPr>
+          <w:p>
+            <w:pPr>
+              <w:jc w:val="center"/>
+              <w:cnfStyle w:val="100000000000" w:firstRow="1" w:lastRow="0" w:firstColumn="0" w:lastColumn="0" w:oddVBand="0" w:evenVBand="0" w:oddHBand="0" w:evenHBand="0" w:firstRowFirstColumn="0" w:firstRowLastColumn="0" w:lastRowFirstColumn="0" w:lastRowLastColumn="0"/>
+              <w:rPr>
+                <w:rFonts w:asciiTheme="minorHAnsi" w:hAnsiTheme="minorHAnsi" w:cstheme="minorHAnsi"/>
+                <w:b/>
+                <w:bCs/>
+                <w:i w:val="0"/>
+                <w:smallCaps/>
+                <w:color w:val="0D0D0D" w:themeColor="text1" w:themeTint="F2"/>
+                <w:sz w:val="20"/>
+                <w:szCs w:val="20"/>
+              </w:rPr>
+            </w:pPr>
+            <w:r>
+              <w:rPr>
+                <w:rFonts w:asciiTheme="minorHAnsi" w:hAnsiTheme="minorHAnsi" w:cstheme="minorHAnsi"/>
+                <w:b/>
+                <w:bCs/>
+                <w:i w:val="0"/>
+                <w:smallCaps/>
+                <w:color w:val="0D0D0D" w:themeColor="text1" w:themeTint="F2"/>
+                <w:sz w:val="20"/>
+                <w:szCs w:val="20"/>
+              </w:rPr>
+              <w:t>% of Targeted Bp Covered</w:t>
+            </w:r>
+          </w:p>
+        </w:tc>
+      </w:tr>
+      <w:tr>
+        <w:trPr>
+          <w:cnfStyle w:val="000000100000" w:firstRow="0" w:lastRow="0" w:firstColumn="0" w:lastColumn="0" w:oddVBand="0" w:evenVBand="0" w:oddHBand="1" w:evenHBand="0" w:firstRowFirstColumn="0" w:firstRowLastColumn="0" w:lastRowFirstColumn="0" w:lastRowLastColumn="0"/>
+          <w:trHeight w:val="152"/>
+        </w:trPr>
+        <w:tc>
+          <w:tcPr>
+            <w:cnfStyle w:val="001000000000" w:firstRow="0" w:lastRow="0" w:firstColumn="1" w:lastColumn="0" w:oddVBand="0" w:evenVBand="0" w:oddHBand="0" w:evenHBand="0" w:firstRowFirstColumn="0" w:firstRowLastColumn="0" w:lastRowFirstColumn="0" w:lastRowLastColumn="0"/>
+            <w:tcW w:w="2520" w:type="dxa"/>
+            <w:vMerge/>
+            <w:tcBorders>
+              <w:right w:val="single" w:sz="6" w:space="0" w:color="000000" w:themeColor="text1"/>
+            </w:tcBorders>
+          </w:tcPr>
+          <w:p>
+            <w:pPr>
+              <w:rPr>
+                <w:rFonts w:cstheme="minorHAnsi"/>
+                <w:i w:val="0"/>
+                <w:iCs w:val="0"/>
+                <w:smallCaps/>
+                <w:color w:val="0D0D0D" w:themeColor="text1" w:themeTint="F2"/>
+              </w:rPr>
+            </w:pPr>
+          </w:p>
+        </w:tc>
+        <w:tc>
+          <w:tcPr>
+            <w:tcW w:w="2070" w:type="dxa"/>
+            <w:vMerge/>
+            <w:tcBorders>
+              <w:right w:val="single" w:sz="6" w:space="0" w:color="000000" w:themeColor="text1"/>
+            </w:tcBorders>
+          </w:tcPr>
+          <w:p>
+            <w:pPr>
+              <w:cnfStyle w:val="000000100000" w:firstRow="0" w:lastRow="0" w:firstColumn="0" w:lastColumn="0" w:oddVBand="0" w:evenVBand="0" w:oddHBand="1" w:evenHBand="0" w:firstRowFirstColumn="0" w:firstRowLastColumn="0" w:lastRowFirstColumn="0" w:lastRowLastColumn="0"/>
+              <w:rPr>
+                <w:rFonts w:cstheme="minorHAnsi"/>
+                <w:smallCaps/>
+                <w:color w:val="0D0D0D" w:themeColor="text1" w:themeTint="F2"/>
+              </w:rPr>
+            </w:pPr>
+          </w:p>
+        </w:tc>
+        <w:tc>
+          <w:tcPr>
+            <w:tcW w:w="1260" w:type="dxa"/>
+            <w:vMerge/>
+            <w:tcBorders>
+              <w:right w:val="single" w:sz="6" w:space="0" w:color="000000" w:themeColor="text1"/>
+            </w:tcBorders>
+          </w:tcPr>
+          <w:p>
+            <w:pPr>
+              <w:cnfStyle w:val="000000100000" w:firstRow="0" w:lastRow="0" w:firstColumn="0" w:lastColumn="0" w:oddVBand="0" w:evenVBand="0" w:oddHBand="1" w:evenHBand="0" w:firstRowFirstColumn="0" w:firstRowLastColumn="0" w:lastRowFirstColumn="0" w:lastRowLastColumn="0"/>
+              <w:rPr>
+                <w:rFonts w:cstheme="minorHAnsi"/>
+                <w:smallCaps/>
+                <w:color w:val="0D0D0D" w:themeColor="text1" w:themeTint="F2"/>
+              </w:rPr>
+            </w:pPr>
+          </w:p>
+        </w:tc>
+        <w:tc>
+          <w:tcPr>
+            <w:tcW w:w="1170" w:type="dxa"/>
+            <w:tcBorders>
+              <w:left w:val="single" w:sz="6" w:space="0" w:color="000000" w:themeColor="text1"/>
+              <w:right w:val="single" w:sz="4" w:space="0" w:color="auto"/>
+            </w:tcBorders>
+            <w:shd w:val="clear" w:color="auto" w:fill="EDEDED"/>
+            <w:vAlign w:val="bottom"/>
+          </w:tcPr>
+          <w:p>
+            <w:pPr>
+              <w:jc w:val="center"/>
+              <w:cnfStyle w:val="000000100000" w:firstRow="0" w:lastRow="0" w:firstColumn="0" w:lastColumn="0" w:oddVBand="0" w:evenVBand="0" w:oddHBand="1" w:evenHBand="0" w:firstRowFirstColumn="0" w:firstRowLastColumn="0" w:lastRowFirstColumn="0" w:lastRowLastColumn="0"/>
+              <w:rPr>
+                <w:rFonts w:cstheme="minorHAnsi"/>
+                <w:b/>
+                <w:smallCaps/>
+                <w:color w:val="0D0D0D" w:themeColor="text1" w:themeTint="F2"/>
+                <w:sz w:val="20"/>
+                <w:szCs w:val="20"/>
+              </w:rPr>
+            </w:pPr>
+            <w:r>
+              <w:rPr>
+                <w:rFonts w:cstheme="minorHAnsi"/>
+                <w:b/>
+                <w:smallCaps/>
+                <w:color w:val="0D0D0D" w:themeColor="text1" w:themeTint="F2"/>
+                <w:sz w:val="20"/>
+                <w:szCs w:val="20"/>
+              </w:rPr>
+              <w:t>≥</w:t>
+            </w:r>
+            <w:r>
+              <w:rPr>
+                <w:rFonts w:cstheme="minorHAnsi"/>
+                <w:b/>
+                <w:smallCaps/>
+                <w:color w:val="0D0D0D" w:themeColor="text1" w:themeTint="F2"/>
+                <w:sz w:val="20"/>
+                <w:szCs w:val="20"/>
+              </w:rPr>
+              <w:t xml:space="preserve"> </w:t>
+            </w:r>
+            <w:r>
+              <w:rPr>
+                <w:rFonts w:cstheme="minorHAnsi"/>
+                <w:b/>
+                <w:smallCaps/>
+                <w:color w:val="0D0D0D" w:themeColor="text1" w:themeTint="F2"/>
+                <w:sz w:val="20"/>
+                <w:szCs w:val="20"/>
+              </w:rPr>
+              <w:t>1X</w:t>
+            </w:r>
+          </w:p>
+        </w:tc>
+        <w:tc>
+          <w:tcPr>
+            <w:tcW w:w="1260" w:type="dxa"/>
+            <w:tcBorders>
+              <w:left w:val="single" w:sz="4" w:space="0" w:color="auto"/>
+              <w:right w:val="single" w:sz="4" w:space="0" w:color="auto"/>
+            </w:tcBorders>
+            <w:shd w:val="clear" w:color="auto" w:fill="EDEDED"/>
+            <w:vAlign w:val="bottom"/>
+          </w:tcPr>
+          <w:p>
+            <w:pPr>
+              <w:jc w:val="center"/>
+              <w:cnfStyle w:val="000000100000" w:firstRow="0" w:lastRow="0" w:firstColumn="0" w:lastColumn="0" w:oddVBand="0" w:evenVBand="0" w:oddHBand="1" w:evenHBand="0" w:firstRowFirstColumn="0" w:firstRowLastColumn="0" w:lastRowFirstColumn="0" w:lastRowLastColumn="0"/>
+              <w:rPr>
+                <w:rFonts w:cstheme="minorHAnsi"/>
+                <w:b/>
+                <w:smallCaps/>
+                <w:color w:val="0D0D0D" w:themeColor="text1" w:themeTint="F2"/>
+                <w:sz w:val="20"/>
+                <w:szCs w:val="20"/>
+              </w:rPr>
+            </w:pPr>
+            <w:r>
+              <w:rPr>
+                <w:rFonts w:cstheme="minorHAnsi"/>
+                <w:b/>
+                <w:smallCaps/>
+                <w:color w:val="0D0D0D" w:themeColor="text1" w:themeTint="F2"/>
+                <w:sz w:val="20"/>
+                <w:szCs w:val="20"/>
+              </w:rPr>
+              <w:t>≥ 20X</w:t>
+            </w:r>
+          </w:p>
+        </w:tc>
+        <w:tc>
+          <w:tcPr>
+            <w:tcW w:w="1260" w:type="dxa"/>
+            <w:tcBorders>
+              <w:left w:val="single" w:sz="4" w:space="0" w:color="auto"/>
+              <w:right w:val="single" w:sz="4" w:space="0" w:color="auto"/>
+            </w:tcBorders>
+            <w:shd w:val="clear" w:color="auto" w:fill="EDEDED"/>
+            <w:vAlign w:val="bottom"/>
+          </w:tcPr>
+          <w:p>
+            <w:pPr>
+              <w:jc w:val="center"/>
+              <w:cnfStyle w:val="000000100000" w:firstRow="0" w:lastRow="0" w:firstColumn="0" w:lastColumn="0" w:oddVBand="0" w:evenVBand="0" w:oddHBand="1" w:evenHBand="0" w:firstRowFirstColumn="0" w:firstRowLastColumn="0" w:lastRowFirstColumn="0" w:lastRowLastColumn="0"/>
+              <w:rPr>
+                <w:rFonts w:cstheme="minorHAnsi"/>
+                <w:b/>
+                <w:smallCaps/>
+                <w:color w:val="0D0D0D" w:themeColor="text1" w:themeTint="F2"/>
+                <w:sz w:val="20"/>
+                <w:szCs w:val="20"/>
+              </w:rPr>
+            </w:pPr>
+            <w:r>
+              <w:rPr>
+                <w:rFonts w:cstheme="minorHAnsi"/>
+                <w:b/>
+                <w:smallCaps/>
+                <w:color w:val="0D0D0D" w:themeColor="text1" w:themeTint="F2"/>
+                <w:sz w:val="20"/>
+                <w:szCs w:val="20"/>
+              </w:rPr>
+              <w:t>≥ 100X</w:t>
+            </w:r>
+          </w:p>
+        </w:tc>
+        <w:tc>
+          <w:tcPr>
+            <w:tcW w:w="1260" w:type="dxa"/>
+            <w:tcBorders>
+              <w:left w:val="single" w:sz="4" w:space="0" w:color="auto"/>
+            </w:tcBorders>
+            <w:shd w:val="clear" w:color="auto" w:fill="EDEDED"/>
+            <w:vAlign w:val="bottom"/>
+          </w:tcPr>
+          <w:p>
+            <w:pPr>
+              <w:jc w:val="center"/>
+              <w:cnfStyle w:val="000000100000" w:firstRow="0" w:lastRow="0" w:firstColumn="0" w:lastColumn="0" w:oddVBand="0" w:evenVBand="0" w:oddHBand="1" w:evenHBand="0" w:firstRowFirstColumn="0" w:firstRowLastColumn="0" w:lastRowFirstColumn="0" w:lastRowLastColumn="0"/>
+              <w:rPr>
+                <w:rFonts w:cstheme="minorHAnsi"/>
+                <w:b/>
+                <w:smallCaps/>
+                <w:color w:val="0D0D0D" w:themeColor="text1" w:themeTint="F2"/>
+                <w:sz w:val="20"/>
+                <w:szCs w:val="20"/>
+              </w:rPr>
+            </w:pPr>
+            <w:r>
+              <w:rPr>
+                <w:rFonts w:cstheme="minorHAnsi"/>
+                <w:b/>
+                <w:smallCaps/>
+                <w:color w:val="0D0D0D" w:themeColor="text1" w:themeTint="F2"/>
+                <w:sz w:val="20"/>
+                <w:szCs w:val="20"/>
+              </w:rPr>
+              <w:t>≥ 500X</w:t>
+            </w:r>
+          </w:p>
+        </w:tc>
+      </w:tr>
+      <w:tr>
+        <w:trPr>
+          <w:trHeight w:val="179"/>
+        </w:trPr>
+        <w:tc>
+          <w:tcPr>
+            <w:cnfStyle w:val="001000000000" w:firstRow="0" w:lastRow="0" w:firstColumn="1" w:lastColumn="0" w:oddVBand="0" w:evenVBand="0" w:oddHBand="0" w:evenHBand="0" w:firstRowFirstColumn="0" w:firstRowLastColumn="0" w:lastRowFirstColumn="0" w:lastRowLastColumn="0"/>
+            <w:tcW w:w="2520" w:type="dxa"/>
+            <w:tcBorders>
+              <w:right w:val="single" w:sz="6" w:space="0" w:color="auto"/>
+            </w:tcBorders>
+            <w:vAlign w:val="bottom"/>
+          </w:tcPr>
+          <w:p>
+            <w:pPr>
+              <w:jc w:val="left"/>
+              <w:rPr>
+                <w:rFonts w:asciiTheme="minorHAnsi" w:hAnsiTheme="minorHAnsi" w:cstheme="minorHAnsi"/>
+                <w:i w:val="0"/>
+                <w:iCs w:val="0"/>
+                <w:smallCaps/>
+                <w:color w:val="0D0D0D" w:themeColor="text1" w:themeTint="F2"/>
+                <w:sz w:val="20"/>
+                <w:szCs w:val="20"/>
+              </w:rPr>
+            </w:pPr>
+            <w:r>
+              <w:rPr>
+                <w:rFonts w:asciiTheme="minorHAnsi" w:hAnsiTheme="minorHAnsi" w:cstheme="minorHAnsi"/>
+                <w:i w:val="0"/>
+                <w:iCs w:val="0"/>
+                <w:color w:val="000000" w:themeColor="text1"/>
+                <w:sz w:val="20"/>
+                <w:szCs w:val="20"/>
+              </w:rPr>
+              <w:t>{#</w:t>
+            </w:r>
+            <w:proofErr w:type="gramStart"/>
+            <w:r>
+              <w:rPr>
+                <w:rFonts w:asciiTheme="minorHAnsi" w:hAnsiTheme="minorHAnsi" w:cstheme="minorHAnsi"/>
+                <w:i w:val="0"/>
+                <w:iCs w:val="0"/>
+                <w:color w:val="000000" w:themeColor="text1"/>
+                <w:sz w:val="20"/>
+                <w:szCs w:val="20"/>
+              </w:rPr>
+              <w:t>coverageStats}</w:t>
+            </w:r>
+            <w:r>
+              <w:rPr>
+                <w:rFonts w:asciiTheme="minorHAnsi" w:hAnsiTheme="minorHAnsi" w:cstheme="minorHAnsi"/>
+                <w:i w:val="0"/>
+                <w:iCs w:val="0"/>
+                <w:color w:val="000000" w:themeColor="text1"/>
+                <w:sz w:val="20"/>
+                <w:szCs w:val="20"/>
+              </w:rPr>
+              <w:t>{</w:t>
+            </w:r>
+            <w:proofErr w:type="gramEnd"/>
+            <w:r>
+              <w:rPr>
+                <w:rFonts w:asciiTheme="minorHAnsi" w:hAnsiTheme="minorHAnsi" w:cstheme="minorHAnsi"/>
+                <w:i w:val="0"/>
+                <w:iCs w:val="0"/>
+                <w:color w:val="000000" w:themeColor="text1"/>
+                <w:sz w:val="20"/>
+                <w:szCs w:val="20"/>
+              </w:rPr>
+              <w:t>Region}</w:t>
+            </w:r>
+          </w:p>
+        </w:tc>
+        <w:tc>
+          <w:tcPr>
+            <w:tcW w:w="2070" w:type="dxa"/>
+            <w:tcBorders>
+              <w:right w:val="single" w:sz="6" w:space="0" w:color="auto"/>
+            </w:tcBorders>
+            <w:vAlign w:val="bottom"/>
+          </w:tcPr>
+          <w:p>
+            <w:pPr>
+              <w:jc w:val="center"/>
+              <w:cnfStyle w:val="000000000000" w:firstRow="0" w:lastRow="0" w:firstColumn="0" w:lastColumn="0" w:oddVBand="0" w:evenVBand="0" w:oddHBand="0" w:evenHBand="0" w:firstRowFirstColumn="0" w:firstRowLastColumn="0" w:lastRowFirstColumn="0" w:lastRowLastColumn="0"/>
+              <w:rPr>
+                <w:rFonts w:cstheme="minorHAnsi"/>
+                <w:smallCaps/>
+                <w:color w:val="0D0D0D" w:themeColor="text1" w:themeTint="F2"/>
+                <w:sz w:val="20"/>
+                <w:szCs w:val="20"/>
+              </w:rPr>
+            </w:pPr>
+            <w:r>
+              <w:rPr>
+                <w:rFonts w:cstheme="minorHAnsi"/>
+                <w:color w:val="0D0D0D" w:themeColor="text1" w:themeTint="F2"/>
+                <w:sz w:val="20"/>
+                <w:szCs w:val="20"/>
+              </w:rPr>
+              <w:t>{</w:t>
+            </w:r>
+            <w:r>
+              <w:rPr>
+                <w:rFonts w:cstheme="minorHAnsi"/>
+                <w:color w:val="0D0D0D" w:themeColor="text1" w:themeTint="F2"/>
+                <w:sz w:val="20"/>
+                <w:szCs w:val="20"/>
+              </w:rPr>
+              <w:t>Name</w:t>
+            </w:r>
+            <w:r>
+              <w:rPr>
+                <w:rFonts w:cstheme="minorHAnsi"/>
+                <w:color w:val="0D0D0D" w:themeColor="text1" w:themeTint="F2"/>
+                <w:sz w:val="20"/>
+                <w:szCs w:val="20"/>
+              </w:rPr>
+              <w:t>}</w:t>
+            </w:r>
+          </w:p>
+        </w:tc>
+        <w:tc>
+          <w:tcPr>
+            <w:tcW w:w="1260" w:type="dxa"/>
+            <w:tcBorders>
+              <w:right w:val="single" w:sz="6" w:space="0" w:color="auto"/>
+            </w:tcBorders>
+            <w:vAlign w:val="bottom"/>
+          </w:tcPr>
+          <w:p>
+            <w:pPr>
+              <w:jc w:val="center"/>
+              <w:cnfStyle w:val="000000000000" w:firstRow="0" w:lastRow="0" w:firstColumn="0" w:lastColumn="0" w:oddVBand="0" w:evenVBand="0" w:oddHBand="0" w:evenHBand="0" w:firstRowFirstColumn="0" w:firstRowLastColumn="0" w:lastRowFirstColumn="0" w:lastRowLastColumn="0"/>
+              <w:rPr>
+                <w:rFonts w:cstheme="minorHAnsi"/>
+                <w:smallCaps/>
+                <w:color w:val="0D0D0D" w:themeColor="text1" w:themeTint="F2"/>
+                <w:sz w:val="20"/>
+                <w:szCs w:val="20"/>
+              </w:rPr>
+            </w:pPr>
+            <w:r>
+              <w:rPr>
+                <w:rFonts w:cstheme="minorHAnsi"/>
+                <w:color w:val="0D0D0D" w:themeColor="text1" w:themeTint="F2"/>
+                <w:sz w:val="20"/>
+                <w:szCs w:val="20"/>
+              </w:rPr>
+              <w:t>{</w:t>
+            </w:r>
+            <w:r>
+              <w:rPr>
+                <w:rFonts w:cstheme="minorHAnsi"/>
+                <w:color w:val="0D0D0D" w:themeColor="text1" w:themeTint="F2"/>
+                <w:sz w:val="20"/>
+                <w:szCs w:val="20"/>
+              </w:rPr>
+              <w:t>MeanDepth|round2</w:t>
+            </w:r>
+            <w:r>
+              <w:rPr>
+                <w:rFonts w:cstheme="minorHAnsi"/>
+                <w:color w:val="0D0D0D" w:themeColor="text1" w:themeTint="F2"/>
+                <w:sz w:val="20"/>
+                <w:szCs w:val="20"/>
+              </w:rPr>
+              <w:t>}</w:t>
+            </w:r>
+          </w:p>
+        </w:tc>
+        <w:tc>
+          <w:tcPr>
+            <w:tcW w:w="1170" w:type="dxa"/>
+            <w:tcBorders>
+              <w:left w:val="single" w:sz="6" w:space="0" w:color="auto"/>
+              <w:right w:val="single" w:sz="4" w:space="0" w:color="auto"/>
+            </w:tcBorders>
+            <w:vAlign w:val="bottom"/>
+          </w:tcPr>
+          <w:p>
+            <w:pPr>
+              <w:jc w:val="center"/>
+              <w:cnfStyle w:val="000000000000" w:firstRow="0" w:lastRow="0" w:firstColumn="0" w:lastColumn="0" w:oddVBand="0" w:evenVBand="0" w:oddHBand="0" w:evenHBand="0" w:firstRowFirstColumn="0" w:firstRowLastColumn="0" w:lastRowFirstColumn="0" w:lastRowLastColumn="0"/>
+              <w:rPr>
+                <w:rFonts w:cstheme="majorHAnsi"/>
+                <w:b/>
+                <w:bCs/>
+                <w:smallCaps/>
+                <w:color w:val="0D0D0D" w:themeColor="text1" w:themeTint="F2"/>
+                <w:sz w:val="20"/>
+                <w:szCs w:val="20"/>
+              </w:rPr>
+            </w:pPr>
+            <w:r>
+              <w:rPr>
+                <w:rFonts w:cstheme="majorHAnsi"/>
+                <w:b/>
+                <w:color w:val="404040" w:themeColor="text1" w:themeTint="BF"/>
+                <w:sz w:val="20"/>
+                <w:szCs w:val="20"/>
+              </w:rPr>
+              <w:t>{</w:t>
+            </w:r>
+            <w:r>
+              <w:rPr>
+                <w:rFonts w:cstheme="majorHAnsi"/>
+                <w:b/>
+                <w:color w:val="404040" w:themeColor="text1" w:themeTint="BF"/>
+                <w:sz w:val="20"/>
+                <w:szCs w:val="20"/>
+              </w:rPr>
+              <w:t>col1x|round</w:t>
+            </w:r>
+            <w:proofErr w:type="gramStart"/>
+            <w:r>
+              <w:rPr>
+                <w:rFonts w:cstheme="majorHAnsi"/>
+                <w:b/>
+                <w:color w:val="404040" w:themeColor="text1" w:themeTint="BF"/>
+                <w:sz w:val="20"/>
+                <w:szCs w:val="20"/>
+              </w:rPr>
+              <w:t>2</w:t>
+            </w:r>
+            <w:r>
+              <w:rPr>
+                <w:rFonts w:cstheme="majorHAnsi"/>
+                <w:b/>
+                <w:color w:val="404040" w:themeColor="text1" w:themeTint="BF"/>
+                <w:sz w:val="20"/>
+                <w:szCs w:val="20"/>
+              </w:rPr>
+              <w:t>}%</w:t>
+            </w:r>
+            <w:proofErr w:type="gramEnd"/>
+          </w:p>
+        </w:tc>
+        <w:tc>
+          <w:tcPr>
+            <w:tcW w:w="1260" w:type="dxa"/>
+            <w:tcBorders>
+              <w:left w:val="single" w:sz="4" w:space="0" w:color="auto"/>
+              <w:right w:val="single" w:sz="4" w:space="0" w:color="auto"/>
+            </w:tcBorders>
+            <w:vAlign w:val="bottom"/>
+          </w:tcPr>
+          <w:p>
+            <w:pPr>
+              <w:jc w:val="center"/>
+              <w:cnfStyle w:val="000000000000" w:firstRow="0" w:lastRow="0" w:firstColumn="0" w:lastColumn="0" w:oddVBand="0" w:evenVBand="0" w:oddHBand="0" w:evenHBand="0" w:firstRowFirstColumn="0" w:firstRowLastColumn="0" w:lastRowFirstColumn="0" w:lastRowLastColumn="0"/>
+              <w:rPr>
+                <w:rFonts w:cstheme="majorHAnsi"/>
+                <w:b/>
+                <w:bCs/>
+                <w:smallCaps/>
+                <w:color w:val="0D0D0D" w:themeColor="text1" w:themeTint="F2"/>
+                <w:sz w:val="20"/>
+                <w:szCs w:val="20"/>
+              </w:rPr>
+            </w:pPr>
+            <w:r>
+              <w:rPr>
+                <w:rFonts w:cstheme="majorHAnsi"/>
+                <w:b/>
+                <w:color w:val="404040" w:themeColor="text1" w:themeTint="BF"/>
+                <w:sz w:val="20"/>
+                <w:szCs w:val="20"/>
+              </w:rPr>
+              <w:t>{</w:t>
+            </w:r>
+            <w:r>
+              <w:rPr>
+                <w:rFonts w:cstheme="majorHAnsi"/>
+                <w:b/>
+                <w:color w:val="404040" w:themeColor="text1" w:themeTint="BF"/>
+                <w:sz w:val="20"/>
+                <w:szCs w:val="20"/>
+              </w:rPr>
+              <w:t>col</w:t>
+            </w:r>
+            <w:r>
+              <w:rPr>
+                <w:rFonts w:cstheme="majorHAnsi"/>
+                <w:b/>
+                <w:color w:val="404040" w:themeColor="text1" w:themeTint="BF"/>
+                <w:sz w:val="20"/>
+                <w:szCs w:val="20"/>
+              </w:rPr>
+              <w:t>20x</w:t>
+            </w:r>
+            <w:r>
+              <w:rPr>
+                <w:rFonts w:cstheme="majorHAnsi"/>
+                <w:b/>
+                <w:color w:val="404040" w:themeColor="text1" w:themeTint="BF"/>
+                <w:sz w:val="20"/>
+                <w:szCs w:val="20"/>
+              </w:rPr>
+              <w:t>|round</w:t>
+            </w:r>
+            <w:proofErr w:type="gramStart"/>
+            <w:r>
+              <w:rPr>
+                <w:rFonts w:cstheme="majorHAnsi"/>
+                <w:b/>
+                <w:color w:val="404040" w:themeColor="text1" w:themeTint="BF"/>
+                <w:sz w:val="20"/>
+                <w:szCs w:val="20"/>
+              </w:rPr>
+              <w:t>2</w:t>
+            </w:r>
+            <w:r>
+              <w:rPr>
+                <w:rFonts w:cstheme="majorHAnsi"/>
+                <w:b/>
+                <w:color w:val="404040" w:themeColor="text1" w:themeTint="BF"/>
+                <w:sz w:val="20"/>
+                <w:szCs w:val="20"/>
+              </w:rPr>
+              <w:t>}%</w:t>
+            </w:r>
+            <w:proofErr w:type="gramEnd"/>
+          </w:p>
+        </w:tc>
+        <w:tc>
+          <w:tcPr>
+            <w:tcW w:w="1260" w:type="dxa"/>
+            <w:tcBorders>
+              <w:left w:val="single" w:sz="4" w:space="0" w:color="auto"/>
+              <w:right w:val="single" w:sz="4" w:space="0" w:color="auto"/>
+            </w:tcBorders>
+            <w:vAlign w:val="bottom"/>
+          </w:tcPr>
+          <w:p>
+            <w:pPr>
+              <w:jc w:val="center"/>
+              <w:cnfStyle w:val="000000000000" w:firstRow="0" w:lastRow="0" w:firstColumn="0" w:lastColumn="0" w:oddVBand="0" w:evenVBand="0" w:oddHBand="0" w:evenHBand="0" w:firstRowFirstColumn="0" w:firstRowLastColumn="0" w:lastRowFirstColumn="0" w:lastRowLastColumn="0"/>
+              <w:rPr>
+                <w:rFonts w:cstheme="majorHAnsi"/>
+                <w:b/>
+                <w:bCs/>
+                <w:smallCaps/>
+                <w:color w:val="0D0D0D" w:themeColor="text1" w:themeTint="F2"/>
+                <w:sz w:val="20"/>
+                <w:szCs w:val="20"/>
+              </w:rPr>
+            </w:pPr>
+            <w:r>
+              <w:rPr>
+                <w:rFonts w:cstheme="majorHAnsi"/>
+                <w:b/>
+                <w:color w:val="404040" w:themeColor="text1" w:themeTint="BF"/>
+                <w:sz w:val="20"/>
+                <w:szCs w:val="20"/>
+              </w:rPr>
+              <w:t>{</w:t>
+            </w:r>
+            <w:r>
+              <w:rPr>
+                <w:rFonts w:cstheme="majorHAnsi"/>
+                <w:b/>
+                <w:color w:val="404040" w:themeColor="text1" w:themeTint="BF"/>
+                <w:sz w:val="20"/>
+                <w:szCs w:val="20"/>
+              </w:rPr>
+              <w:t>col</w:t>
+            </w:r>
+            <w:r>
+              <w:rPr>
+                <w:rFonts w:cstheme="majorHAnsi"/>
+                <w:b/>
+                <w:color w:val="404040" w:themeColor="text1" w:themeTint="BF"/>
+                <w:sz w:val="20"/>
+                <w:szCs w:val="20"/>
+              </w:rPr>
+              <w:t>100x</w:t>
+            </w:r>
+            <w:r>
+              <w:rPr>
+                <w:rFonts w:cstheme="majorHAnsi"/>
+                <w:b/>
+                <w:color w:val="404040" w:themeColor="text1" w:themeTint="BF"/>
+                <w:sz w:val="20"/>
+                <w:szCs w:val="20"/>
+              </w:rPr>
+              <w:t>|round</w:t>
+            </w:r>
+            <w:proofErr w:type="gramStart"/>
+            <w:r>
+              <w:rPr>
+                <w:rFonts w:cstheme="majorHAnsi"/>
+                <w:b/>
+                <w:color w:val="404040" w:themeColor="text1" w:themeTint="BF"/>
+                <w:sz w:val="20"/>
+                <w:szCs w:val="20"/>
+              </w:rPr>
+              <w:t>2</w:t>
+            </w:r>
+            <w:r>
+              <w:rPr>
+                <w:rFonts w:cstheme="majorHAnsi"/>
+                <w:b/>
+                <w:color w:val="404040" w:themeColor="text1" w:themeTint="BF"/>
+                <w:sz w:val="20"/>
+                <w:szCs w:val="20"/>
+              </w:rPr>
+              <w:t>}%</w:t>
+            </w:r>
+            <w:proofErr w:type="gramEnd"/>
+          </w:p>
+        </w:tc>
+        <w:tc>
+          <w:tcPr>
+            <w:tcW w:w="1260" w:type="dxa"/>
+            <w:tcBorders>
+              <w:left w:val="single" w:sz="4" w:space="0" w:color="auto"/>
+            </w:tcBorders>
+            <w:vAlign w:val="bottom"/>
+          </w:tcPr>
+          <w:p>
+            <w:pPr>
+              <w:jc w:val="center"/>
+              <w:cnfStyle w:val="000000000000" w:firstRow="0" w:lastRow="0" w:firstColumn="0" w:lastColumn="0" w:oddVBand="0" w:evenVBand="0" w:oddHBand="0" w:evenHBand="0" w:firstRowFirstColumn="0" w:firstRowLastColumn="0" w:lastRowFirstColumn="0" w:lastRowLastColumn="0"/>
+              <w:rPr>
+                <w:rFonts w:cstheme="majorHAnsi"/>
+                <w:b/>
+                <w:bCs/>
+                <w:smallCaps/>
+                <w:color w:val="0D0D0D" w:themeColor="text1" w:themeTint="F2"/>
+                <w:sz w:val="20"/>
+                <w:szCs w:val="20"/>
+              </w:rPr>
+            </w:pPr>
+            <w:r>
+              <w:rPr>
+                <w:rFonts w:cstheme="majorHAnsi"/>
+                <w:b/>
+                <w:color w:val="404040" w:themeColor="text1" w:themeTint="BF"/>
+                <w:sz w:val="20"/>
+                <w:szCs w:val="20"/>
+              </w:rPr>
+              <w:t>{</w:t>
+            </w:r>
+            <w:r>
+              <w:rPr>
+                <w:rFonts w:cstheme="majorHAnsi"/>
+                <w:b/>
+                <w:color w:val="404040" w:themeColor="text1" w:themeTint="BF"/>
+                <w:sz w:val="20"/>
+                <w:szCs w:val="20"/>
+              </w:rPr>
+              <w:t>col</w:t>
+            </w:r>
+            <w:r>
+              <w:rPr>
+                <w:rFonts w:cstheme="majorHAnsi"/>
+                <w:b/>
+                <w:color w:val="404040" w:themeColor="text1" w:themeTint="BF"/>
+                <w:sz w:val="20"/>
+                <w:szCs w:val="20"/>
+              </w:rPr>
+              <w:t>500x</w:t>
+            </w:r>
+            <w:r>
+              <w:rPr>
+                <w:rFonts w:cstheme="majorHAnsi"/>
+                <w:b/>
+                <w:color w:val="404040" w:themeColor="text1" w:themeTint="BF"/>
+                <w:sz w:val="20"/>
+                <w:szCs w:val="20"/>
+              </w:rPr>
+              <w:t>|round</w:t>
+            </w:r>
+            <w:proofErr w:type="gramStart"/>
+            <w:r>
+              <w:rPr>
+                <w:rFonts w:cstheme="majorHAnsi"/>
+                <w:b/>
+                <w:color w:val="404040" w:themeColor="text1" w:themeTint="BF"/>
+                <w:sz w:val="20"/>
+                <w:szCs w:val="20"/>
+              </w:rPr>
+              <w:t>2</w:t>
+            </w:r>
+            <w:r>
+              <w:rPr>
+                <w:rFonts w:cstheme="majorHAnsi"/>
+                <w:b/>
+                <w:color w:val="404040" w:themeColor="text1" w:themeTint="BF"/>
+                <w:sz w:val="20"/>
+                <w:szCs w:val="20"/>
+              </w:rPr>
+              <w:t>}%</w:t>
+            </w:r>
+            <w:proofErr w:type="gramEnd"/>
+            <w:r>
+              <w:rPr>
+                <w:rFonts w:cstheme="majorHAnsi"/>
+                <w:b/>
+                <w:color w:val="404040" w:themeColor="text1" w:themeTint="BF"/>
+                <w:sz w:val="20"/>
+                <w:szCs w:val="20"/>
+              </w:rPr>
+              <w:t>{/}</w:t>
+            </w:r>
+          </w:p>
+        </w:tc>
+      </w:tr>
+    </w:tbl>
+    <w:p>
+      <w:pPr>
+        <w:rPr>
+          <w:b/>
+          <w:bCs/>
+          <w:color w:val="000000" w:themeColor="text1"/>
+          <w:sz w:val="20"/>
+          <w:szCs w:val="20"/>
+        </w:rPr>
+      </w:pPr>
+      <w:r>
+        <w:rPr>
+          <w:b/>
+          <w:bCs/>
+          <w:color w:val="000000" w:themeColor="text1"/>
+          <w:sz w:val="20"/>
+          <w:szCs w:val="20"/>
         </w:rPr>
         <w:t>{</w:t>
       </w:r>
-      <w:r>
-        <w:rPr>
-          <w:sz w:val="26"/>
-          <w:szCs w:val="26"/>
-        </w:rPr>
-        <w:t>#citations.length&gt;0</w:t>
-      </w:r>
-      <w:r>
-        <w:rPr>
-          <w:sz w:val="26"/>
-          <w:szCs w:val="26"/>
-        </w:rPr>
-        <w:t>}</w:t>
+      <w:proofErr w:type="gramStart"/>
+      <w:r>
+        <w:rPr>
+          <w:b/>
+          <w:bCs/>
+          <w:color w:val="000000" w:themeColor="text1"/>
+          <w:sz w:val="20"/>
+          <w:szCs w:val="20"/>
+        </w:rPr>
+        <w:t>/}</w:t>
+      </w:r>
+      <w:r>
+        <w:rPr>
+          <w:b/>
+          <w:bCs/>
+          <w:color w:val="000000" w:themeColor="text1"/>
+          <w:sz w:val="20"/>
+          <w:szCs w:val="20"/>
+        </w:rPr>
+        <w:t>{</w:t>
+      </w:r>
+      <w:proofErr w:type="gramEnd"/>
+      <w:r>
+        <w:rPr>
+          <w:b/>
+          <w:bCs/>
+          <w:color w:val="000000" w:themeColor="text1"/>
+          <w:sz w:val="20"/>
+          <w:szCs w:val="20"/>
+        </w:rPr>
+        <w:t>#</w:t>
+      </w:r>
+      <w:proofErr w:type="gramStart"/>
+      <w:r>
+        <w:rPr>
+          <w:b/>
+          <w:bCs/>
+          <w:color w:val="000000" w:themeColor="text1"/>
+          <w:sz w:val="20"/>
+          <w:szCs w:val="20"/>
+        </w:rPr>
+        <w:t>citations.length</w:t>
+      </w:r>
+      <w:proofErr w:type="gramEnd"/>
+      <w:r>
+        <w:rPr>
+          <w:b/>
+          <w:bCs/>
+          <w:color w:val="000000" w:themeColor="text1"/>
+          <w:sz w:val="20"/>
+          <w:szCs w:val="20"/>
+        </w:rPr>
+        <w:t>&gt;0}</w:t>
       </w:r>
     </w:p>
     <w:p>
@@ -5746,6 +7778,7 @@
               </w:rPr>
               <w:t>{#</w:t>
             </w:r>
+            <w:proofErr w:type="gramStart"/>
             <w:r>
               <w:rPr>
                 <w:b w:val="0"/>
@@ -5773,6 +7806,7 @@
               </w:rPr>
               <w:t>{</w:t>
             </w:r>
+            <w:proofErr w:type="gramEnd"/>
             <w:r>
               <w:rPr>
                 <w:b w:val="0"/>
@@ -5814,15 +7848,33 @@
                 <w:sz w:val="20"/>
                 <w:szCs w:val="20"/>
               </w:rPr>
-              <w:t>{citation}</w:t>
-            </w:r>
+              <w:t>{citation</w:t>
+            </w:r>
+            <w:proofErr w:type="gramStart"/>
             <w:r>
               <w:rPr>
                 <w:color w:val="404040" w:themeColor="text1" w:themeTint="BF"/>
                 <w:sz w:val="20"/>
                 <w:szCs w:val="20"/>
               </w:rPr>
-              <w:t>{/}</w:t>
+              <w:t>}</w:t>
+            </w:r>
+            <w:r>
+              <w:rPr>
+                <w:color w:val="404040" w:themeColor="text1" w:themeTint="BF"/>
+                <w:sz w:val="20"/>
+                <w:szCs w:val="20"/>
+              </w:rPr>
+              <w:t>{</w:t>
+            </w:r>
+            <w:proofErr w:type="gramEnd"/>
+            <w:r>
+              <w:rPr>
+                <w:color w:val="404040" w:themeColor="text1" w:themeTint="BF"/>
+                <w:sz w:val="20"/>
+                <w:szCs w:val="20"/>
+              </w:rPr>
+              <w:t>/}</w:t>
             </w:r>
           </w:p>
         </w:tc>
@@ -5837,6 +7889,7 @@
           <w:szCs w:val="20"/>
         </w:rPr>
       </w:pPr>
+      <w:proofErr w:type="gramStart"/>
       <w:r>
         <w:rPr>
           <w:rFonts w:cstheme="minorHAnsi"/>
@@ -5847,6 +7900,7 @@
         <w:t>{/}</w:t>
       </w:r>
       <w:bookmarkEnd w:id="0"/>
+      <w:proofErr w:type="gramEnd"/>
     </w:p>
     <w:p>
       <w:pPr>
@@ -5966,7 +8020,21 @@
             <w:rPr>
               <w:sz w:val="16"/>
             </w:rPr>
-            <w:t>{sampleState.patientName}</w:t>
+            <w:t>{</w:t>
+          </w:r>
+          <w:proofErr w:type="spellStart"/>
+          <w:r>
+            <w:rPr>
+              <w:sz w:val="16"/>
+            </w:rPr>
+            <w:t>sampleState.patientName</w:t>
+          </w:r>
+          <w:proofErr w:type="spellEnd"/>
+          <w:r>
+            <w:rPr>
+              <w:sz w:val="16"/>
+            </w:rPr>
+            <w:t>}</w:t>
           </w:r>
           <w:r>
             <w:rPr>
@@ -5986,7 +8054,25 @@
               <w:bCs/>
               <w:sz w:val="16"/>
             </w:rPr>
-            <w:t>{sampleState.dob}</w:t>
+            <w:t>{</w:t>
+          </w:r>
+          <w:proofErr w:type="spellStart"/>
+          <w:r>
+            <w:rPr>
+              <w:b/>
+              <w:bCs/>
+              <w:sz w:val="16"/>
+            </w:rPr>
+            <w:t>sampleState.dob</w:t>
+          </w:r>
+          <w:proofErr w:type="spellEnd"/>
+          <w:r>
+            <w:rPr>
+              <w:b/>
+              <w:bCs/>
+              <w:sz w:val="16"/>
+            </w:rPr>
+            <w:t>}</w:t>
           </w:r>
           <w:r>
             <w:rPr>
@@ -6284,7 +8370,14 @@
             <w:rPr>
               <w:b/>
             </w:rPr>
-            <w:t>{sampleState.</w:t>
+            <w:t>{</w:t>
+          </w:r>
+          <w:proofErr w:type="spellStart"/>
+          <w:r>
+            <w:rPr>
+              <w:b/>
+            </w:rPr>
+            <w:t>sampleState.</w:t>
           </w:r>
           <w:r>
             <w:rPr>
@@ -6292,6 +8385,7 @@
             </w:rPr>
             <w:t>patientName</w:t>
           </w:r>
+          <w:proofErr w:type="spellEnd"/>
           <w:r>
             <w:rPr>
               <w:b/>
@@ -6330,7 +8424,14 @@
             <w:rPr>
               <w:b/>
             </w:rPr>
-            <w:t>{sampleState.</w:t>
+            <w:t>{</w:t>
+          </w:r>
+          <w:proofErr w:type="spellStart"/>
+          <w:r>
+            <w:rPr>
+              <w:b/>
+            </w:rPr>
+            <w:t>sampleState.</w:t>
           </w:r>
           <w:r>
             <w:rPr>
@@ -6338,6 +8439,7 @@
             </w:rPr>
             <w:t>reportDate</w:t>
           </w:r>
+          <w:proofErr w:type="spellEnd"/>
           <w:r>
             <w:rPr>
               <w:b/>

</xml_diff>